<commit_message>
Add sentence-specific answer explanations
</commit_message>
<xml_diff>
--- a/BGE_szurt_szakszavak_prezpoziciok_osszefoglalo.docx
+++ b/BGE_szurt_szakszavak_prezpoziciok_osszefoglalo.docx
@@ -602,7 +602,7 @@
     </w:p>
     <w:p>
       <w:r>
-        <w:t>Minden egyedi tétel egyszer szerepel, saját mondattal. A hiányzó helyre a teljes megoldást kell beírni.</w:t>
+        <w:t>Minden egyedi tétel egyszer szerepel, saját mondattal. A hiányzó helyre a teljes megoldást kell beírni. Az indoklás az adott mondat jelentéskulcsát és a hiány nyelvtani szerepét magyarázza.</w:t>
       </w:r>
     </w:p>
     <w:p>
@@ -675,7 +675,7 @@
           <w:color w:val="555555"/>
           <w:sz w:val="18"/>
         </w:rPr>
-        <w:t>A mondat definíciója és szakmai helyzete pontosan a(z) 'cultural awareness' fogalmat írja körül; másik tétel nem illik egyszerre a jelentéshez és a nyelvtani szerkezethez.</w:t>
+        <w:t>A mondat kulcsjele: 'Recognising how your own assumptions differ from those of foreign partners requires [hiány]'. A 'cultural awareness' itt a saját kulturális előfeltevések és a más kultúráktól való eltérések tudatos felismerését jelenti. Az ige után a meghatározás tárgyát megnevező főnév vagy főnévi kifejezés szükséges.</w:t>
       </w:r>
     </w:p>
     <w:p>
@@ -740,7 +740,7 @@
           <w:color w:val="555555"/>
           <w:sz w:val="18"/>
         </w:rPr>
-        <w:t>A mondat definíciója és szakmai helyzete pontosan a(z) 'culture shock' fogalmat írja körül; másik tétel nem illik egyszerre a jelentéshez és a nyelvtani szerkezethez.</w:t>
+        <w:t>A mondat kulcsjele: 'Feeling confused and stressed after moving into an unfamiliar business environment is called [hiány]'. A 'culture shock' itt az idegen kulturális környezet okozta zavart és stresszt nevezi meg. A called után a leírt jelenség nevét adó főnév vagy főnévi kifejezés szükséges.</w:t>
       </w:r>
     </w:p>
     <w:p>
@@ -805,7 +805,7 @@
           <w:color w:val="555555"/>
           <w:sz w:val="18"/>
         </w:rPr>
-        <w:t>A mondat definíciója és szakmai helyzete pontosan a(z) 'host-country culture' fogalmat írja körül; másik tétel nem illik egyszerre a jelentéshez és a nyelvtani szerkezethez.</w:t>
+        <w:t>A mondat kulcsjele: 'Before an overseas assignment, employees must learn the norms of the [hiány]'. A 'host-country culture' itt annak az országnak a normáit jelenti, ahol a külföldi munkavállaló dolgozik. A the névelő után a mondatban egy konkrét, azonosítható főnévi megnevezés áll.</w:t>
       </w:r>
     </w:p>
     <w:p>
@@ -870,7 +870,7 @@
           <w:color w:val="555555"/>
           <w:sz w:val="18"/>
         </w:rPr>
-        <w:t>A mondat definíciója és szakmai helyzete pontosan a(z) 'business etiquette' fogalmat írja körül; másik tétel nem illik egyszerre a jelentéshez és a nyelvtani szerkezethez.</w:t>
+        <w:t>A mondat kulcsjele: 'Rules about greetings, dress, gifts and meeting behaviour form a country's [hiány]'. A 'business etiquette' itt az üzleti üdvözlés, öltözködés, ajándékozás és tárgyalási viselkedés szabályrendszere. A hiány helyén a mondat állítmányához illeszkedő teljes szakmai szó vagy kifejezés szükséges.</w:t>
       </w:r>
     </w:p>
     <w:p>
@@ -935,7 +935,7 @@
           <w:color w:val="555555"/>
           <w:sz w:val="18"/>
         </w:rPr>
-        <w:t>A mondat definíciója és szakmai helyzete pontosan a(z) 'protocol' fogalmat írja körül; másik tétel nem illik egyszerre a jelentéshez és a nyelvtani szerkezethez.</w:t>
+        <w:t>A mondat kulcsjele: 'The official order for greeting senior delegates is determined by diplomatic [hiány]'. A 'protocol' itt a hivatalos rangsor és üdvözlési sorrend szabályait jelenti. A hiány helyén a mondat állítmányához illeszkedő teljes szakmai szó vagy kifejezés szükséges.</w:t>
       </w:r>
     </w:p>
     <w:p>
@@ -1000,7 +1000,7 @@
           <w:color w:val="555555"/>
           <w:sz w:val="18"/>
         </w:rPr>
-        <w:t>A mondat definíciója és szakmai helyzete pontosan a(z) 'personal space' fogalmat írja körül; másik tétel nem illik egyszerre a jelentéshez és a nyelvtani szerkezethez.</w:t>
+        <w:t>A mondat kulcsjele: 'Standing too close can make a British colleague feel that you have invaded their [hiány]'. A 'personal space' itt azt a fizikai távolságot jelenti, amelyet valaki maga körül kényelmesnek érez. A hiány helyén a mondat állítmányához illeszkedő teljes szakmai szó vagy kifejezés szükséges.</w:t>
       </w:r>
     </w:p>
     <w:p>
@@ -1065,7 +1065,7 @@
           <w:color w:val="555555"/>
           <w:sz w:val="18"/>
         </w:rPr>
-        <w:t>A mondat definíciója és szakmai helyzete pontosan a(z) 'hierarchy' fogalmat írja körül; másik tétel nem illik egyszerre a jelentéshez és a nyelvtani szerkezethez.</w:t>
+        <w:t>A mondat kulcsjele: 'In a strongly ranked organisation, decisions follow a clear chain of authority known as the [hiány]'. A 'hierarchy' itt a szervezeti rangok és döntési jogosultságok láncolatát nevezi meg. A the névelő után a mondatban egy konkrét, azonosítható főnévi megnevezés áll.</w:t>
       </w:r>
     </w:p>
     <w:p>
@@ -1130,7 +1130,7 @@
           <w:color w:val="555555"/>
           <w:sz w:val="18"/>
         </w:rPr>
-        <w:t>A mondat definíciója és szakmai helyzete pontosan a(z) 'seniority' fogalmat írja körül; másik tétel nem illik egyszerre a jelentéshez és a nyelvtani szerkezethez.</w:t>
+        <w:t>A mondat kulcsjele: 'At the meeting, the longest-serving executive spoke first because [hiány] is highly respected'. A 'seniority' itt a hosszabb szolgálati időből vagy magasabb rangból eredő elsőbbséget jelenti. A hiányt az utána következő 'is' szóval együtt kell nyelvtanilag és jelentésben értelmezni.</w:t>
       </w:r>
     </w:p>
     <w:p>
@@ -1195,7 +1195,7 @@
           <w:color w:val="555555"/>
           <w:sz w:val="18"/>
         </w:rPr>
-        <w:t>A mondat definíciója és szakmai helyzete pontosan a(z) 'non-judgemental' fogalmat írja körül; másik tétel nem illik egyszerre a jelentéshez és a nyelvtani szerkezethez.</w:t>
+        <w:t>A mondat kulcsjele: 'An effective intercultural listener remains [hiány] instead of labelling unfamiliar behaviour as wrong'. A 'non-judgemental' itt olyan hozzáállást jelöl, amely nem minősíti helytelennek az ismeretlen viselkedést. A létige után az alanyt megnevező vagy minősítő állítmánykiegészítő szükséges.</w:t>
       </w:r>
     </w:p>
     <w:p>
@@ -1260,7 +1260,7 @@
           <w:color w:val="555555"/>
           <w:sz w:val="18"/>
         </w:rPr>
-        <w:t>A mondat definíciója és szakmai helyzete pontosan a(z) 'adaptability' fogalmat írja körül; másik tétel nem illik egyszerre a jelentéshez és a nyelvtani szerkezethez.</w:t>
+        <w:t>A mondat kulcsjele: 'The ability to change your behaviour when local norms differ demonstrates [hiány]'. A 'adaptability' itt a helyi normákhoz igazított viselkedés képességét jelenti. A hiány helyén a mondat állítmányához illeszkedő teljes szakmai szó vagy kifejezés szükséges.</w:t>
       </w:r>
     </w:p>
     <w:p>
@@ -1325,7 +1325,7 @@
           <w:color w:val="555555"/>
           <w:sz w:val="18"/>
         </w:rPr>
-        <w:t>A mondat definíciója és szakmai helyzete pontosan a(z) 'flexibility' fogalmat írja körül; másik tétel nem illik egyszerre a jelentéshez és a nyelvtani szerkezethez.</w:t>
+        <w:t>A mondat kulcsjele: 'Agreeing to modify the agenda when a partner needs more relationship time shows [hiány]'. A 'flexibility' itt a terv vagy napirend megváltoztatására való készséget fejezi ki. Az ige után a meghatározás tárgyát megnevező főnév vagy főnévi kifejezés szükséges.</w:t>
       </w:r>
     </w:p>
     <w:p>
@@ -1390,7 +1390,7 @@
           <w:color w:val="555555"/>
           <w:sz w:val="18"/>
         </w:rPr>
-        <w:t>A mondat definíciója és szakmai helyzete pontosan a(z) 'relationship-building' fogalmat írja körül; másik tétel nem illik egyszerre a jelentéshez és a nyelvtani szerkezethez.</w:t>
+        <w:t>A mondat kulcsjele: 'In many cultures, dinners and informal meetings are essential for [hiány] before contracts are discussed'. A 'relationship-building' itt a szerződéskötés előtti bizalom és személyes kapcsolat kialakítását jelenti. A hiányt az utána következő 'before' szóval együtt kell nyelvtanilag és jelentésben értelmezni.</w:t>
       </w:r>
     </w:p>
     <w:p>
@@ -1455,7 +1455,7 @@
           <w:color w:val="555555"/>
           <w:sz w:val="18"/>
         </w:rPr>
-        <w:t>A mondat definíciója és szakmai helyzete pontosan a(z) 'small talk' fogalmat írja körül; másik tétel nem illik egyszerre a jelentéshez és a nyelvtani szerkezethez.</w:t>
+        <w:t>A mondat kulcsjele: 'A brief conversation about travel or weather before the formal meeting is [hiány]'. A 'small talk' itt a hivatalos tárgyalás előtti rövid, kötetlen beszélgetést nevezi meg. A létige után az alanyt megnevező vagy minősítő állítmánykiegészítő szükséges.</w:t>
       </w:r>
     </w:p>
     <w:p>
@@ -1520,7 +1520,7 @@
           <w:color w:val="555555"/>
           <w:sz w:val="18"/>
         </w:rPr>
-        <w:t>A mondat definíciója és szakmai helyzete pontosan a(z) 'punctuality' fogalmat írja körül; másik tétel nem illik egyszerre a jelentéshez és a nyelvtani szerkezethez.</w:t>
+        <w:t>A mondat kulcsjele: 'Arriving exactly at the agreed time demonstrates [hiány]'. A 'punctuality' itt a megbeszélt időpont pontos betartását jelenti. A hiány helyén a mondat állítmányához illeszkedő teljes szakmai szó vagy kifejezés szükséges.</w:t>
       </w:r>
     </w:p>
     <w:p>
@@ -1585,7 +1585,7 @@
           <w:color w:val="555555"/>
           <w:sz w:val="18"/>
         </w:rPr>
-        <w:t>A mondat definíciója és szakmai helyzete pontosan a(z) 'directness' fogalmat írja körül; másik tétel nem illik egyszerre a jelentéshez és a nyelvtani szerkezethez.</w:t>
+        <w:t>A mondat kulcsjele: 'Saying exactly what you mean without softening the message is known as [hiány]'. A 'directness' itt az egyenes, kerülő és enyhítő megfogalmazás nélküli kommunikációt jelenti. A hiány helyén a mondat állítmányához illeszkedő teljes szakmai szó vagy kifejezés szükséges.</w:t>
       </w:r>
     </w:p>
     <w:p>
@@ -1650,7 +1650,7 @@
           <w:color w:val="555555"/>
           <w:sz w:val="18"/>
         </w:rPr>
-        <w:t>A mondat definíciója és szakmai helyzete pontosan a(z) 'formal' fogalmat írja körül; másik tétel nem illik egyszerre a jelentéshez és a nyelvtani szerkezethez.</w:t>
+        <w:t>A mondat kulcsjele: 'A letter using titles, surnames and conventional closing phrases has a [hiány] style'. A 'formal' itt címeket, vezetékneveket és hagyományos formulákat használó stílust jelöl. A hiány az utána álló 'style' főnevet módosítja, ezért jelzői szerepű elem kell.</w:t>
       </w:r>
     </w:p>
     <w:p>
@@ -1715,7 +1715,7 @@
           <w:color w:val="555555"/>
           <w:sz w:val="18"/>
         </w:rPr>
-        <w:t>A mondat definíciója és szakmai helyzete pontosan a(z) 'informal' fogalmat írja körül; másik tétel nem illik egyszerre a jelentéshez és a nyelvtani szerkezethez.</w:t>
+        <w:t>A mondat kulcsjele: 'An email to a close colleague using first names and contractions is [hiány]'. A 'informal' itt közvetlen, keresztneveket és összevont alakokat használó stílust jelöl. A létige után az alanyt megnevező vagy minősítő állítmánykiegészítő szükséges.</w:t>
       </w:r>
     </w:p>
     <w:p>
@@ -1780,7 +1780,7 @@
           <w:color w:val="555555"/>
           <w:sz w:val="18"/>
         </w:rPr>
-        <w:t>A mondat definíciója és szakmai helyzete pontosan a(z) 'business cards' fogalmat írja körül; másik tétel nem illik egyszerre a jelentéshez és a nyelvtani szerkezethez.</w:t>
+        <w:t>A mondat kulcsjele: 'In China, visitors should present their [hiány] with both hands'. A 'business cards' itt az üzleti elérhetőséget és beosztást tartalmazó névjegykártyákat nevezi meg. A hiányt az utána következő 'with' szóval együtt kell nyelvtanilag és jelentésben értelmezni.</w:t>
       </w:r>
     </w:p>
     <w:p>
@@ -1845,7 +1845,7 @@
           <w:color w:val="555555"/>
           <w:sz w:val="18"/>
         </w:rPr>
-        <w:t>A mondat definíciója és szakmai helyzete pontosan a(z) 'gifts' fogalmat írja körül; másik tétel nem illik egyszerre a jelentéshez és a nyelvtani szerkezethez.</w:t>
+        <w:t>A mondat kulcsjele: 'Before visiting a partner, check whether local taboos make certain [hiány] inappropriate'. A 'gifts' itt az üzleti látogatáskor adott ajándékokat jelenti, amelyekre helyi tabuk vonatkozhatnak. A hiányt az utána következő 'inappropriate' szóval együtt kell nyelvtanilag és jelentésben értelmezni.</w:t>
       </w:r>
     </w:p>
     <w:p>
@@ -1910,7 +1910,7 @@
           <w:color w:val="555555"/>
           <w:sz w:val="18"/>
         </w:rPr>
-        <w:t>A mondat definíciója és szakmai helyzete pontosan a(z) 'body language' fogalmat írja körül; másik tétel nem illik egyszerre a jelentéshez és a nyelvtani szerkezethez.</w:t>
+        <w:t>A mondat kulcsjele: 'Eye contact, gestures and posture are all forms of [hiány]'. A 'body language' itt a szemkontaktus, gesztusok és testtartás nem verbális üzeneteit foglalja össze. A hiány helyén a mondat állítmányához illeszkedő teljes szakmai szó vagy kifejezés szükséges.</w:t>
       </w:r>
     </w:p>
     <w:p>
@@ -1975,7 +1975,7 @@
           <w:color w:val="555555"/>
           <w:sz w:val="18"/>
         </w:rPr>
-        <w:t>A mondat definíciója és szakmai helyzete pontosan a(z) 'social etiquette' fogalmat írja körül; másik tétel nem illik egyszerre a jelentéshez és a nyelvtani szerkezethez.</w:t>
+        <w:t>A mondat kulcsjele: 'Knowing how to behave politely at dinners and receptions is part of [hiány]'. A 'social etiquette' itt a vacsorákon és fogadásokon elvárt udvarias viselkedés szabályait jelenti. A hiány helyén a mondat állítmányához illeszkedő teljes szakmai szó vagy kifejezés szükséges.</w:t>
       </w:r>
     </w:p>
     <w:p>
@@ -2040,7 +2040,7 @@
           <w:color w:val="555555"/>
           <w:sz w:val="18"/>
         </w:rPr>
-        <w:t>A mondat definíciója és szakmai helyzete pontosan a(z) 'cultural training' fogalmat írja körül; másik tétel nem illik egyszerre a jelentéshez és a nyelvtani szerkezethez.</w:t>
+        <w:t>A mondat kulcsjele: 'The company prepared expatriates for local customs through [hiány]'. A 'cultural training' itt a külföldi kiküldetés előtti, helyi szokásokra felkészítő képzést jelenti. A hiány helyén a mondat állítmányához illeszkedő teljes szakmai szó vagy kifejezés szükséges.</w:t>
       </w:r>
     </w:p>
     <w:p>
@@ -2113,7 +2113,7 @@
           <w:color w:val="555555"/>
           <w:sz w:val="18"/>
         </w:rPr>
-        <w:t>A mondat definíciója és szakmai helyzete pontosan a(z) 'break the ice' fogalmat írja körül; másik tétel nem illik egyszerre a jelentéshez és a nyelvtani szerkezethez.</w:t>
+        <w:t>A mondat kulcsjele: 'The host told a light joke at the start of the meeting to [hiány]'. A 'break the ice' itt az első feszültség oldását és a beszélgetés elindítását jelenti. A hiány előtt álló to után alapigei alak vagy teljes igei kifejezés szükséges.</w:t>
       </w:r>
     </w:p>
     <w:p>
@@ -2178,7 +2178,7 @@
           <w:color w:val="555555"/>
           <w:sz w:val="18"/>
         </w:rPr>
-        <w:t>A mondat definíciója és szakmai helyzete pontosan a(z) 'see eye to eye' fogalmat írja körül; másik tétel nem illik egyszerre a jelentéshez és a nyelvtani szerkezethez.</w:t>
+        <w:t>A mondat kulcsjele: 'The two managers completely agree on the expansion plan; they [hiány]'. A 'see eye to eye' itt azt jelenti, hogy a felek teljesen egyetértenek. A hiány helyén a mondat állítmányához illeszkedő teljes szakmai szó vagy kifejezés szükséges.</w:t>
       </w:r>
     </w:p>
     <w:p>
@@ -2243,7 +2243,7 @@
           <w:color w:val="555555"/>
           <w:sz w:val="18"/>
         </w:rPr>
-        <w:t>A mondat definíciója és szakmai helyzete pontosan a(z) 'be thrown in at the deep end' fogalmat írja körül; másik tétel nem illik egyszerre a jelentéshez és a nyelvtani szerkezethez.</w:t>
+        <w:t>A mondat kulcsjele: 'With no training, the new employee had to lead an international negotiation and therefore seemed to [hiány]'. A 'be thrown in at the deep end' itt felkészítés nélkül rögtön nehéz feladatba kerülést jelent. A hiány előtt álló to után alapigei alak vagy teljes igei kifejezés szükséges.</w:t>
       </w:r>
     </w:p>
     <w:p>
@@ -2308,7 +2308,7 @@
           <w:color w:val="555555"/>
           <w:sz w:val="18"/>
         </w:rPr>
-        <w:t>A mondat definíciója és szakmai helyzete pontosan a(z) 'get into hot water' fogalmat írja körül; másik tétel nem illik egyszerre a jelentéshez és a nyelvtani szerkezethez.</w:t>
+        <w:t>A mondat kulcsjele: 'Ignoring the country's gift rules may cause a visitor to [hiány] with local partners'. A 'get into hot water' itt kellemetlen vagy problémás helyzetbe kerülést jelent. A hiány előtt álló to után alapigei alak vagy teljes igei kifejezés szükséges.</w:t>
       </w:r>
     </w:p>
     <w:p>
@@ -2373,7 +2373,7 @@
           <w:color w:val="555555"/>
           <w:sz w:val="18"/>
         </w:rPr>
-        <w:t>A mondat definíciója és szakmai helyzete pontosan a(z) 'put one's foot in it' fogalmat írja körül; másik tétel nem illik egyszerre a jelentéshez és a nyelvtani szerkezethez.</w:t>
+        <w:t>A mondat kulcsjele: 'By asking an embarrassing personal question at dinner, a guest can [hiány]'. A 'put one's foot in it' itt kínos vagy tapintatlan megjegyzés elkövetését jelenti. A módbeli segédige után ragozatlan alapige vagy teljes igei kifejezés szükséges.</w:t>
       </w:r>
     </w:p>
     <w:p>
@@ -2438,7 +2438,7 @@
           <w:color w:val="555555"/>
           <w:sz w:val="18"/>
         </w:rPr>
-        <w:t>A mondat definíciója és szakmai helyzete pontosan a(z) 'get on like a house on fire' fogalmat írja körül; másik tétel nem illik egyszerre a jelentéshez és a nyelvtani szerkezethez.</w:t>
+        <w:t>A mondat kulcsjele: 'The Hungarian manager and her Polish agent became friends immediately and [hiány]'. A 'get on like a house on fire' itt azonnal kialakuló, nagyon jó személyes kapcsolatot jelent. A hiány helyén a mondat állítmányához illeszkedő teljes szakmai szó vagy kifejezés szükséges.</w:t>
       </w:r>
     </w:p>
     <w:p>
@@ -2503,7 +2503,7 @@
           <w:color w:val="555555"/>
           <w:sz w:val="18"/>
         </w:rPr>
-        <w:t>A mondat definíciója és szakmai helyzete pontosan a(z) 'be like a fish out of water' fogalmat írja körül; másik tétel nem illik egyszerre a jelentéshez és a nyelvtani szerkezethez.</w:t>
+        <w:t>A mondat kulcsjele: 'A newcomer who feels completely uncomfortable at a foreign reception may [hiány]'. A 'be like a fish out of water' itt idegen helyzetben érzett teljes kényelmetlenséget jelent. A módbeli segédige után ragozatlan alapige vagy teljes igei kifejezés szükséges.</w:t>
       </w:r>
     </w:p>
     <w:p>
@@ -2568,7 +2568,7 @@
           <w:color w:val="555555"/>
           <w:sz w:val="18"/>
         </w:rPr>
-        <w:t>A mondat definíciója és szakmai helyzete pontosan a(z) 'be a real eye-opener' fogalmat írja körül; másik tétel nem illik egyszerre a jelentéshez és a nyelvtani szerkezethez.</w:t>
+        <w:t>A mondat kulcsjele: 'Discovering how differently another culture negotiates can [hiány] for a first-time visitor'. A 'be a real eye-opener' itt meglepő és új felismerést adó tapasztalatot jelent. A módbeli segédige után ragozatlan alapige vagy teljes igei kifejezés szükséges.</w:t>
       </w:r>
     </w:p>
     <w:p>
@@ -2633,7 +2633,7 @@
           <w:color w:val="555555"/>
           <w:sz w:val="18"/>
         </w:rPr>
-        <w:t>A mondat definíciója és szakmai helyzete pontosan a(z) 'go with the flow' fogalmat írja körül; másik tétel nem illik egyszerre a jelentéshez és a nyelvtani szerkezethez.</w:t>
+        <w:t>A mondat kulcsjele: 'When the local partner changes the programme unexpectedly, the flexible visitor should [hiány]'. A 'go with the flow' itt a váratlan változások rugalmas elfogadását jelenti. A módbeli segédige után ragozatlan alapige vagy teljes igei kifejezés szükséges.</w:t>
       </w:r>
     </w:p>
     <w:p>
@@ -2698,7 +2698,7 @@
           <w:color w:val="555555"/>
           <w:sz w:val="18"/>
         </w:rPr>
-        <w:t>A mondat definíciója és szakmai helyzete pontosan a(z) 'the ball is in your court' fogalmat írja körül; másik tétel nem illik egyszerre a jelentéshez és a nyelvtani szerkezethez.</w:t>
+        <w:t>A mondat kulcsjele: 'We have sent our final offer, so the next decision is yours; [hiány]'. A 'the ball is in your court' itt azt jelenti, hogy a következő döntés vagy lépés a másik félen múlik. A hiány helyén a mondat állítmányához illeszkedő teljes szakmai szó vagy kifejezés szükséges.</w:t>
       </w:r>
     </w:p>
     <w:p>
@@ -2763,7 +2763,7 @@
           <w:color w:val="555555"/>
           <w:sz w:val="18"/>
         </w:rPr>
-        <w:t>A mondat definíciója és szakmai helyzete pontosan a(z) 'know something inside out' fogalmat írja körül; másik tétel nem illik egyszerre a jelentéshez és a nyelvtani szerkezethez.</w:t>
+        <w:t>A mondat kulcsjele: 'After ten years in the market, she understands every detail and can [hiány]'. A 'know something inside out' itt valaminek minden részletre kiterjedő ismeretét jelenti. A módbeli segédige után ragozatlan alapige vagy teljes igei kifejezés szükséges.</w:t>
       </w:r>
     </w:p>
     <w:p>
@@ -2828,7 +2828,7 @@
           <w:color w:val="555555"/>
           <w:sz w:val="18"/>
         </w:rPr>
-        <w:t>A mondat definíciója és szakmai helyzete pontosan a(z) 'run over schedule' fogalmat írja körül; másik tétel nem illik egyszerre a jelentéshez és a nyelvtani szerkezethez.</w:t>
+        <w:t>A mondat kulcsjele: 'Because the discussion lasted longer than planned, the meeting began to [hiány]'. A 'run over schedule' itt a tervezett időkeret túllépését jelenti. A hiány előtt álló to után alapigei alak vagy teljes igei kifejezés szükséges.</w:t>
       </w:r>
     </w:p>
     <w:p>
@@ -2893,7 +2893,7 @@
           <w:color w:val="555555"/>
           <w:sz w:val="18"/>
         </w:rPr>
-        <w:t>A mondat definíciója és szakmai helyzete pontosan a(z) 'be up to your eyes in work' fogalmat írja körül; másik tétel nem illik egyszerre a jelentéshez és a nyelvtani szerkezethez.</w:t>
+        <w:t>A mondat kulcsjele: 'When several deadlines arrive together, you may [hiány]'. A 'be up to your eyes in work' itt rendkívül sok munkával való elárasztottságot jelent. A módbeli segédige után ragozatlan alapige vagy teljes igei kifejezés szükséges.</w:t>
       </w:r>
     </w:p>
     <w:p>
@@ -2958,7 +2958,7 @@
           <w:color w:val="555555"/>
           <w:sz w:val="18"/>
         </w:rPr>
-        <w:t>A mondat definíciója és szakmai helyzete pontosan a(z) 'have a good grasp of' fogalmat írja körül; másik tétel nem illik egyszerre a jelentéshez és a nyelvtani szerkezethez.</w:t>
+        <w:t>A mondat kulcsjele: 'A well-prepared expatriate should [hiány] the host country's business customs'. A 'have a good grasp of' itt valaminek biztos és alapos megértését jelenti. A módbeli segédige után ragozatlan alapige vagy teljes igei kifejezés szükséges.</w:t>
       </w:r>
     </w:p>
     <w:p>
@@ -3031,7 +3031,7 @@
           <w:color w:val="555555"/>
           <w:sz w:val="18"/>
         </w:rPr>
-        <w:t>A mondat definíciója és szakmai helyzete pontosan a(z) 'casual workers' fogalmat írja körül; másik tétel nem illik egyszerre a jelentéshez és a nyelvtani szerkezethez.</w:t>
+        <w:t>A mondat kulcsjele: 'Employees hired only when needed and often paid by the day are [hiány]'. A 'casual workers' itt csak szükség esetén foglalkoztatott, gyakran napidíjas dolgozókat jelent. A többes számú alany és az are/were után többes számú megnevezés vagy állítmánykiegészítő illik.</w:t>
       </w:r>
     </w:p>
     <w:p>
@@ -3096,7 +3096,7 @@
           <w:color w:val="555555"/>
           <w:sz w:val="18"/>
         </w:rPr>
-        <w:t>A mondat definíciója és szakmai helyzete pontosan a(z) 'migrant workers' fogalmat írja körül; másik tétel nem illik egyszerre a jelentéshez és a nyelvtani szerkezethez.</w:t>
+        <w:t>A mondat kulcsjele: 'People who move to another country or region in order to find employment are [hiány]'. A 'migrant workers' itt munkavállalásért más országba vagy régióba költöző dolgozókat jelent. A többes számú alany és az are/were után többes számú megnevezés vagy állítmánykiegészítő illik.</w:t>
       </w:r>
     </w:p>
     <w:p>
@@ -3161,7 +3161,7 @@
           <w:color w:val="555555"/>
           <w:sz w:val="18"/>
         </w:rPr>
-        <w:t>A mondat definíciója és szakmai helyzete pontosan a(z) 'self-employed' fogalmat írja körül; másik tétel nem illik egyszerre a jelentéshez és a nyelvtani szerkezethez.</w:t>
+        <w:t>A mondat kulcsjele: 'A person who runs their own business instead of working for an employer is [hiány]'. A 'self-employed' itt saját vállalkozásban, nem munkáltató alkalmazottjaként dolgozó személyt jelöl. A létige után az alanyt megnevező vagy minősítő állítmánykiegészítő szükséges.</w:t>
       </w:r>
     </w:p>
     <w:p>
@@ -3226,7 +3226,7 @@
           <w:color w:val="555555"/>
           <w:sz w:val="18"/>
         </w:rPr>
-        <w:t>A mondat definíciója és szakmai helyzete pontosan a(z) 'employee turnover' fogalmat írja körül; másik tétel nem illik egyszerre a jelentéshez és a nyelvtani szerkezethez.</w:t>
+        <w:t>A mondat kulcsjele: 'The rate at which staff leave and are replaced is called [hiány]'. A 'employee turnover' itt a távozó és újonnan felvett dolgozók cserélődésének arányát jelenti. A called után a leírt jelenség nevét adó főnév vagy főnévi kifejezés szükséges.</w:t>
       </w:r>
     </w:p>
     <w:p>
@@ -3291,7 +3291,7 @@
           <w:color w:val="555555"/>
           <w:sz w:val="18"/>
         </w:rPr>
-        <w:t>A mondat definíciója és szakmai helyzete pontosan a(z) 'seasonal work' fogalmat írja körül; másik tétel nem illik egyszerre a jelentéshez és a nyelvtani szerkezethez.</w:t>
+        <w:t>A mondat kulcsjele: 'A summer job at a holiday resort is a typical example of [hiány]'. A 'seasonal work' itt csak egy adott évszakban rendelkezésre álló munkát jelent. A hiány helyén a mondat állítmányához illeszkedő teljes szakmai szó vagy kifejezés szükséges.</w:t>
       </w:r>
     </w:p>
     <w:p>
@@ -3356,7 +3356,7 @@
           <w:color w:val="555555"/>
           <w:sz w:val="18"/>
         </w:rPr>
-        <w:t>A mondat definíciója és szakmai helyzete pontosan a(z) 'shift work' fogalmat írja körül; másik tétel nem illik egyszerre a jelentéshez és a nyelvtani szerkezethez.</w:t>
+        <w:t>A mondat kulcsjele: 'A hospital staffed through rotating day and night periods depends on [hiány]'. A 'shift work' itt váltakozó nappali és éjszakai időszakokban végzett munkát jelent. A hiány helyén a mondat állítmányához illeszkedő teljes szakmai szó vagy kifejezés szükséges.</w:t>
       </w:r>
     </w:p>
     <w:p>
@@ -3421,7 +3421,7 @@
           <w:color w:val="555555"/>
           <w:sz w:val="18"/>
         </w:rPr>
-        <w:t>A mondat definíciója és szakmai helyzete pontosan a(z) 'job security' fogalmat írja körül; másik tétel nem illik egyszerre a jelentéshez és a nyelvtani szerkezethez.</w:t>
+        <w:t>A mondat kulcsjele: 'Confidence that your employment will continue in the future is known as [hiány]'. A 'job security' itt a foglalkoztatás jövőbeli fennmaradásába vetett biztonságot jelenti. A hiány helyén a mondat állítmányához illeszkedő teljes szakmai szó vagy kifejezés szükséges.</w:t>
       </w:r>
     </w:p>
     <w:p>
@@ -3486,7 +3486,7 @@
           <w:color w:val="555555"/>
           <w:sz w:val="18"/>
         </w:rPr>
-        <w:t>A mondat definíciója és szakmai helyzete pontosan a(z) 'absenteeism' fogalmat írja körül; másik tétel nem illik egyszerre a jelentéshez és a nyelvtani szerkezethez.</w:t>
+        <w:t>A mondat kulcsjele: 'Repeated employee absence from work is measured as [hiány]'. A 'absenteeism' itt a munkavállalók ismétlődő munkahelyi hiányzását jelenti. A hiány helyén a mondat állítmányához illeszkedő teljes szakmai szó vagy kifejezés szükséges.</w:t>
       </w:r>
     </w:p>
     <w:p>
@@ -3551,7 +3551,7 @@
           <w:color w:val="555555"/>
           <w:sz w:val="18"/>
         </w:rPr>
-        <w:t>A mondat definíciója és szakmai helyzete pontosan a(z) 'portfolio workers' fogalmat írja körül; másik tétel nem illik egyszerre a jelentéshez és a nyelvtani szerkezethez.</w:t>
+        <w:t>A mondat kulcsjele: 'Professionals who earn income from several projects and clients are [hiány]'. A 'portfolio workers' itt több ügyfélből és projektből jövedelmet szerző szakembereket jelöl. A többes számú alany és az are/were után többes számú megnevezés vagy állítmánykiegészítő illik.</w:t>
       </w:r>
     </w:p>
     <w:p>
@@ -3616,7 +3616,7 @@
           <w:color w:val="555555"/>
           <w:sz w:val="18"/>
         </w:rPr>
-        <w:t>A mondat definíciója és szakmai helyzete pontosan a(z) 'bonus' fogalmat írja körül; másik tétel nem illik egyszerre a jelentéshez és a nyelvtani szerkezethez.</w:t>
+        <w:t>A mondat kulcsjele: 'An extra payment awarded in addition to normal salary is a [hiány]'. A 'bonus' itt a rendes fizetésen felül adott külön juttatást jelenti. A 'a' névelő megszámlálható, egyes számú főnevet vagy főnévi kifejezést vár.</w:t>
       </w:r>
     </w:p>
     <w:p>
@@ -3681,7 +3681,7 @@
           <w:color w:val="555555"/>
           <w:sz w:val="18"/>
         </w:rPr>
-        <w:t>A mondat definíciója és szakmai helyzete pontosan a(z) 'work-life balance' fogalmat írja körül; másik tétel nem illik egyszerre a jelentéshez és a nyelvtani szerkezethez.</w:t>
+        <w:t>A mondat kulcsjele: 'The healthy division of time between employment and private life is called [hiány]'. A 'work-life balance' itt a munka és a magánélet egészséges időbeli egyensúlyát jelenti. A called után a leírt jelenség nevét adó főnév vagy főnévi kifejezés szükséges.</w:t>
       </w:r>
     </w:p>
     <w:p>
@@ -3746,7 +3746,7 @@
           <w:color w:val="555555"/>
           <w:sz w:val="18"/>
         </w:rPr>
-        <w:t>A mondat definíciója és szakmai helyzete pontosan a(z) 'maternity leave' fogalmat írja körül; másik tétel nem illik egyszerre a jelentéshez és a nyelvtani szerkezethez.</w:t>
+        <w:t>A mondat kulcsjele: 'Paid or protected time away from work after having a baby is [hiány]'. A 'maternity leave' itt a gyermek születése után biztosított fizetett vagy védett távollétet jelenti. A létige után az alanyt megnevező vagy minősítő állítmánykiegészítő szükséges.</w:t>
       </w:r>
     </w:p>
     <w:p>
@@ -3811,7 +3811,7 @@
           <w:color w:val="555555"/>
           <w:sz w:val="18"/>
         </w:rPr>
-        <w:t>A mondat definíciója és szakmai helyzete pontosan a(z) 'redundancy package' fogalmat írja körül; másik tétel nem illik egyszerre a jelentéshez és a nyelvtani szerkezethez.</w:t>
+        <w:t>A mondat kulcsjele: 'Compensation and benefits given when a role disappears form a [hiány]'. A 'redundancy package' itt a munkakör megszűnésekor adott kompenzációt és juttatásokat jelenti. A 'a' névelő megszámlálható, egyes számú főnevet vagy főnévi kifejezést vár.</w:t>
       </w:r>
     </w:p>
     <w:p>
@@ -3876,7 +3876,7 @@
           <w:color w:val="555555"/>
           <w:sz w:val="18"/>
         </w:rPr>
-        <w:t>A mondat definíciója és szakmai helyzete pontosan a(z) 'human resources' fogalmat írja körül; másik tétel nem illik egyszerre a jelentéshez és a nyelvtani szerkezethez.</w:t>
+        <w:t>A mondat kulcsjele: 'The department responsible for recruitment, staff records and workplace policy is [hiány]'. A 'human resources' itt a toborzásért, személyzeti nyilvántartásért és munkahelyi szabályokért felelős részleg. A létige után az alanyt megnevező vagy minősítő állítmánykiegészítő szükséges.</w:t>
       </w:r>
     </w:p>
     <w:p>
@@ -3941,7 +3941,7 @@
           <w:color w:val="555555"/>
           <w:sz w:val="18"/>
         </w:rPr>
-        <w:t>A mondat definíciója és szakmai helyzete pontosan a(z) 'attrition rates' fogalmat írja körül; másik tétel nem illik egyszerre a jelentéshez és a nyelvtani szerkezethez.</w:t>
+        <w:t>A mondat kulcsjele: 'Figures showing how quickly employees leave an organisation are its [hiány]'. A 'attrition rates' itt a munkavállalók szervezetből való távozásának ütemét mutató arányszámokat jelenti. A hiány helyén a mondat állítmányához illeszkedő teljes szakmai szó vagy kifejezés szükséges.</w:t>
       </w:r>
     </w:p>
     <w:p>
@@ -4006,7 +4006,7 @@
           <w:color w:val="555555"/>
           <w:sz w:val="18"/>
         </w:rPr>
-        <w:t>A mondat definíciója és szakmai helyzete pontosan a(z) 'communication skills' fogalmat írja körül; másik tétel nem illik egyszerre a jelentéshez és a nyelvtani szerkezethez.</w:t>
+        <w:t>A mondat kulcsjele: 'Clear speaking, careful listening and effective writing are all [hiány]'. A 'communication skills' itt a világos beszéd, figyelmes hallgatás és hatékony írás készségeit foglalja össze. A hiány helyén a mondat állítmányához illeszkedő teljes szakmai szó vagy kifejezés szükséges.</w:t>
       </w:r>
     </w:p>
     <w:p>
@@ -4071,7 +4071,7 @@
           <w:color w:val="555555"/>
           <w:sz w:val="18"/>
         </w:rPr>
-        <w:t>A mondat definíciója és szakmai helyzete pontosan a(z) 'terminate a contract' fogalmat írja körül; másik tétel nem illik egyszerre a jelentéshez és a nyelvtani szerkezethez.</w:t>
+        <w:t>A mondat kulcsjele: 'Using the formal clause to end a legal employment agreement is to [hiány]'. A 'terminate a contract' itt egy jogi munkaszerződés hivatalos megszüntetését jelenti. A hiány előtt álló to után alapigei alak vagy teljes igei kifejezés szükséges.</w:t>
       </w:r>
     </w:p>
     <w:p>
@@ -4136,7 +4136,7 @@
           <w:color w:val="555555"/>
           <w:sz w:val="18"/>
         </w:rPr>
-        <w:t>A mondat definíciója és szakmai helyzete pontosan a(z) 'dismiss an employee' fogalmat írja körül; másik tétel nem illik egyszerre a jelentéshez és a nyelvtani szerkezethez.</w:t>
+        <w:t>A mondat kulcsjele: 'After serious misconduct, management may formally [hiány]'. A 'dismiss an employee' itt egy munkavállaló munkáltató általi hivatalos elbocsátását jelenti. A hiány helyén a mondat állítmányához illeszkedő teljes szakmai szó vagy kifejezés szükséges.</w:t>
       </w:r>
     </w:p>
     <w:p>
@@ -4201,7 +4201,7 @@
           <w:color w:val="555555"/>
           <w:sz w:val="18"/>
         </w:rPr>
-        <w:t>A mondat definíciója és szakmai helyzete pontosan a(z) 'recruit staff' fogalmat írja körül; másik tétel nem illik egyszerre a jelentéshez és a nyelvtani szerkezethez.</w:t>
+        <w:t>A mondat kulcsjele: 'Advertising vacancies and selecting new employees means trying to [hiány]'. A 'recruit staff' itt állások meghirdetését és új munkavállalók kiválasztását jelenti. A hiány előtt álló to után alapigei alak vagy teljes igei kifejezés szükséges.</w:t>
       </w:r>
     </w:p>
     <w:p>
@@ -4266,7 +4266,7 @@
           <w:color w:val="555555"/>
           <w:sz w:val="18"/>
         </w:rPr>
-        <w:t>A mondat definíciója és szakmai helyzete pontosan a(z) 'take on staff' fogalmat írja körül; másik tétel nem illik egyszerre a jelentéshez és a nyelvtani szerkezethez.</w:t>
+        <w:t>A mondat kulcsjele: 'When demand suddenly grows, a company may hire extra people and [hiány]'. A 'take on staff' itt új munkavállalók felvételét jelenti növekvő munkaerőigény esetén. A hiány helyén a mondat állítmányához illeszkedő teljes szakmai szó vagy kifejezés szükséges.</w:t>
       </w:r>
     </w:p>
     <w:p>
@@ -4331,7 +4331,7 @@
           <w:color w:val="555555"/>
           <w:sz w:val="18"/>
         </w:rPr>
-        <w:t>A mondat definíciója és szakmai helyzete pontosan a(z) 'make staff redundant' fogalmat írja körül; másik tétel nem illik egyszerre a jelentéshez és a nyelvtani szerkezethez.</w:t>
+        <w:t>A mondat kulcsjele: 'If permanent factory closure removes their roles, the company may have to [hiány]'. A 'make staff redundant' itt a munkakörök megszűnése miatti létszámleépítést jelenti. A hiány előtt álló to után alapigei alak vagy teljes igei kifejezés szükséges.</w:t>
       </w:r>
     </w:p>
     <w:p>
@@ -4396,7 +4396,7 @@
           <w:color w:val="555555"/>
           <w:sz w:val="18"/>
         </w:rPr>
-        <w:t>A mondat definíciója és szakmai helyzete pontosan a(z) 'lay off staff' fogalmat írja körül; másik tétel nem illik egyszerre a jelentéshez és a nyelvtani szerkezethez.</w:t>
+        <w:t>A mondat kulcsjele: 'During a downturn, a firm may reduce its workforce and [hiány]'. A 'lay off staff' itt a munkaerő csökkentését és dolgozók elbocsátását jelenti. A hiány helyén a mondat állítmányához illeszkedő teljes szakmai szó vagy kifejezés szükséges.</w:t>
       </w:r>
     </w:p>
     <w:p>
@@ -4461,7 +4461,7 @@
           <w:color w:val="555555"/>
           <w:sz w:val="18"/>
         </w:rPr>
-        <w:t>A mondat definíciója és szakmai helyzete pontosan a(z) 'quit a job' fogalmat írja körül; másik tétel nem illik egyszerre a jelentéshez és a nyelvtani szerkezethez.</w:t>
+        <w:t>A mondat kulcsjele: 'An employee who voluntarily resigns decides to [hiány]'. A 'quit a job' itt a munkavállaló saját döntéséből történő felmondását jelenti. A hiány előtt álló to után alapigei alak vagy teljes igei kifejezés szükséges.</w:t>
       </w:r>
     </w:p>
     <w:p>
@@ -4534,7 +4534,7 @@
           <w:color w:val="555555"/>
           <w:sz w:val="18"/>
         </w:rPr>
-        <w:t>A mondat definíciója és szakmai helyzete pontosan a(z) 'drop in' fogalmat írja körül; másik tétel nem illik egyszerre a jelentéshez és a nyelvtani szerkezethez.</w:t>
+        <w:t>A mondat kulcsjele: 'To mention a fact casually during a conversation is to [hiány] that fact'. A 'drop in' itt egy információ beszélgetésbe való mellékes, alkalmi beszúrását jelenti. A hiány előtt álló to után alapigei alak vagy teljes igei kifejezés szükséges.</w:t>
       </w:r>
     </w:p>
     <w:p>
@@ -4599,7 +4599,7 @@
           <w:color w:val="555555"/>
           <w:sz w:val="18"/>
         </w:rPr>
-        <w:t>A mondat definíciója és szakmai helyzete pontosan a(z) 'juggle' fogalmat írja körül; másik tétel nem illik egyszerre a jelentéshez és a nyelvtani szerkezethez.</w:t>
+        <w:t>A mondat kulcsjele: 'A portfolio worker must [hiány] several clients, deadlines and projects at once'. A 'juggle' itt több ügyfél, határidő és projekt egyidejű összehangolását jelenti. A módbeli segédige után ragozatlan alapige vagy teljes igei kifejezés szükséges.</w:t>
       </w:r>
     </w:p>
     <w:p>
@@ -4664,7 +4664,7 @@
           <w:color w:val="555555"/>
           <w:sz w:val="18"/>
         </w:rPr>
-        <w:t>A mondat definíciója és szakmai helyzete pontosan a(z) 'one-off' fogalmat írja körül; másik tétel nem illik egyszerre a jelentéshez és a nyelvtani szerkezethez.</w:t>
+        <w:t>A mondat kulcsjele: 'A project that happens only once rather than regularly is a [hiány] assignment'. A 'one-off' itt egyszeri, nem rendszeresen ismétlődő megbízást jelöl. A hiány az utána álló 'assignment' főnevet módosítja, ezért jelzői szerepű elem kell.</w:t>
       </w:r>
     </w:p>
     <w:p>
@@ -4729,7 +4729,7 @@
           <w:color w:val="555555"/>
           <w:sz w:val="18"/>
         </w:rPr>
-        <w:t>A mondat definíciója és szakmai helyzete pontosan a(z) 'bid' fogalmat írja körül; másik tétel nem illik egyszerre a jelentéshez és a nyelvtani szerkezethez.</w:t>
+        <w:t>A mondat kulcsjele: 'A freelancer's formal offer stating the price for a project is a [hiány]'. A 'bid' itt egy projekt árára és feltételeire tett hivatalos ajánlatot jelent. A 'a' névelő megszámlálható, egyes számú főnevet vagy főnévi kifejezést vár.</w:t>
       </w:r>
     </w:p>
     <w:p>
@@ -4794,7 +4794,7 @@
           <w:color w:val="555555"/>
           <w:sz w:val="18"/>
         </w:rPr>
-        <w:t>A mondat definíciója és szakmai helyzete pontosan a(z) 'set up' fogalmat írja körül; másik tétel nem illik egyszerre a jelentéshez és a nyelvtani szerkezethez.</w:t>
+        <w:t>A mondat kulcsjele: 'After receiving her redundancy payment, she used the money to [hiány] her own consultancy'. A 'set up' itt egy új vállalkozás vagy tanácsadó cég létrehozását jelenti. A hiány előtt álló to után alapigei alak vagy teljes igei kifejezés szükséges.</w:t>
       </w:r>
     </w:p>
     <w:p>
@@ -4859,7 +4859,7 @@
           <w:color w:val="555555"/>
           <w:sz w:val="18"/>
         </w:rPr>
-        <w:t>A mondat definíciója és szakmai helyzete pontosan a(z) 'gig' fogalmat írja körül; másik tétel nem illik egyszerre a jelentéshez és a nyelvtani szerkezethez.</w:t>
+        <w:t>A mondat kulcsjele: 'A short paid assignment rather than a permanent job is often called a [hiány]'. A 'gig' itt rövid, fizetett megbízást jelent állandó munkaviszony helyett. A 'a' névelő megszámlálható, egyes számú főnevet vagy főnévi kifejezést vár.</w:t>
       </w:r>
     </w:p>
     <w:p>
@@ -4924,7 +4924,7 @@
           <w:color w:val="555555"/>
           <w:sz w:val="18"/>
         </w:rPr>
-        <w:t>A mondat definíciója és szakmai helyzete pontosan a(z) 'bits and pieces' fogalmat írja körül; másik tétel nem illik egyszerre a jelentéshez és a nyelvtani szerkezethez.</w:t>
+        <w:t>A mondat kulcsjele: 'Several small unrelated tasks can be described collectively as [hiány]'. A 'bits and pieces' itt több kisebb, egymástól független feladat összefoglaló neve. A hiány helyén a mondat állítmányához illeszkedő teljes szakmai szó vagy kifejezés szükséges.</w:t>
       </w:r>
     </w:p>
     <w:p>
@@ -4989,7 +4989,7 @@
           <w:color w:val="555555"/>
           <w:sz w:val="18"/>
         </w:rPr>
-        <w:t>A mondat definíciója és szakmai helyzete pontosan a(z) 'paint a bleak picture' fogalmat írja körül; másik tétel nem illik egyszerre a jelentéshez és a nyelvtani szerkezethez.</w:t>
+        <w:t>A mondat kulcsjele: 'A report that presents a very pessimistic view of future employment may [hiány]'. A 'paint a bleak picture' itt nagyon borúlátó jövőképet bemutató leírást jelent. A módbeli segédige után ragozatlan alapige vagy teljes igei kifejezés szükséges.</w:t>
       </w:r>
     </w:p>
     <w:p>
@@ -5054,7 +5054,7 @@
           <w:color w:val="555555"/>
           <w:sz w:val="18"/>
         </w:rPr>
-        <w:t>A mondat definíciója és szakmai helyzete pontosan a(z) 'graft' fogalmat írja körül; másik tétel nem illik egyszerre a jelentéshez és a nyelvtani szerkezethez.</w:t>
+        <w:t>A mondat kulcsjele: 'In informal British English, working extremely hard is to [hiány]'. A 'graft' itt brit informális nyelvben a rendkívül kemény munkát jelenti. A hiány előtt álló to után alapigei alak vagy teljes igei kifejezés szükséges.</w:t>
       </w:r>
     </w:p>
     <w:p>
@@ -5119,7 +5119,7 @@
           <w:color w:val="555555"/>
           <w:sz w:val="18"/>
         </w:rPr>
-        <w:t>A mondat definíciója és szakmai helyzete pontosan a(z) 'keep up to speed' fogalmat írja körül; másik tétel nem illik egyszerre a jelentéshez és a nyelvtani szerkezethez.</w:t>
+        <w:t>A mondat kulcsjele: 'Reading industry news helps freelancers [hiány] with market developments'. A 'keep up to speed' itt a legújabb piaci fejleményekkel való folyamatos lépéstartást jelenti. A hiányt az utána következő 'with' szóval együtt kell nyelvtanilag és jelentésben értelmezni.</w:t>
       </w:r>
     </w:p>
     <w:p>
@@ -5184,7 +5184,7 @@
           <w:color w:val="555555"/>
           <w:sz w:val="18"/>
         </w:rPr>
-        <w:t>A mondat definíciója és szakmai helyzete pontosan a(z) 'not for the fainthearted' fogalmat írja körül; másik tétel nem illik egyszerre a jelentéshez és a nyelvtani szerkezethez.</w:t>
+        <w:t>A mondat kulcsjele: 'Uncertain income and constant self-promotion make portfolio work [hiány]'. A 'not for the fainthearted' itt olyan nehéz helyzetet jelöl, amely nagy bátorságot és kitartást igényel. A hiány helyén a mondat állítmányához illeszkedő teljes szakmai szó vagy kifejezés szükséges.</w:t>
       </w:r>
     </w:p>
     <w:p>
@@ -5249,7 +5249,7 @@
           <w:color w:val="555555"/>
           <w:sz w:val="18"/>
         </w:rPr>
-        <w:t>A mondat definíciója és szakmai helyzete pontosan a(z) 'commitment' fogalmat írja körül; másik tétel nem illik egyszerre a jelentéshez és a nyelvtani szerkezethez.</w:t>
+        <w:t>A mondat kulcsjele: 'A promise or obligation that requires your time and effort is a [hiány]'. A 'commitment' itt időt és erőfeszítést igénylő ígéretet vagy kötelezettséget jelent. A 'a' névelő megszámlálható, egyes számú főnevet vagy főnévi kifejezést vár.</w:t>
       </w:r>
     </w:p>
     <w:p>
@@ -5314,7 +5314,7 @@
           <w:color w:val="555555"/>
           <w:sz w:val="18"/>
         </w:rPr>
-        <w:t>A mondat definíciója és szakmai helyzete pontosan a(z) 'on call' fogalmat írja körül; másik tétel nem illik egyszerre a jelentéshez és a nyelvtani szerkezethez.</w:t>
+        <w:t>A mondat kulcsjele: 'A worker who must be available whenever the employer phones is [hiány]'. A 'on call' itt telefonos értesítésre azonnal rendelkezésre álló munkavállalói állapotot jelenti. A létige után az alanyt megnevező vagy minősítő állítmánykiegészítő szükséges.</w:t>
       </w:r>
     </w:p>
     <w:p>
@@ -5387,7 +5387,7 @@
           <w:color w:val="555555"/>
           <w:sz w:val="18"/>
         </w:rPr>
-        <w:t>A mondat definíciója és szakmai helyzete pontosan a(z) 'pop-up adverts' fogalmat írja körül; másik tétel nem illik egyszerre a jelentéshez és a nyelvtani szerkezethez.</w:t>
+        <w:t>A mondat kulcsjele: 'Online advertisements that suddenly open over webpage content are [hiány]'. A 'pop-up adverts' itt a weboldal tartalma fölött váratlanul megnyíló online hirdetéseket jelenti. A többes számú alany és az are/were után többes számú megnevezés vagy állítmánykiegészítő illik.</w:t>
       </w:r>
     </w:p>
     <w:p>
@@ -5452,7 +5452,7 @@
           <w:color w:val="555555"/>
           <w:sz w:val="18"/>
         </w:rPr>
-        <w:t>A mondat definíciója és szakmai helyzete pontosan a(z) 'mailshots' fogalmat írja körül; másik tétel nem illik egyszerre a jelentéshez és a nyelvtani szerkezethez.</w:t>
+        <w:t>A mondat kulcsjele: 'Bulk promotional letters sent to many addresses in one campaign are [hiány]'. A 'mailshots' itt egy kampányban sok címre kiküldött tömeges reklámleveleket jelenti. A többes számú alany és az are/were után többes számú megnevezés vagy állítmánykiegészítő illik.</w:t>
       </w:r>
     </w:p>
     <w:p>
@@ -5517,7 +5517,7 @@
           <w:color w:val="555555"/>
           <w:sz w:val="18"/>
         </w:rPr>
-        <w:t>A mondat definíciója és szakmai helyzete pontosan a(z) 'cold calling' fogalmat írja körül; másik tétel nem illik egyszerre a jelentéshez és a nyelvtani szerkezethez.</w:t>
+        <w:t>A mondat kulcsjele: 'Phoning potential customers who have had no previous contact with the company is [hiány]'. A 'cold calling' itt korábbi kapcsolat nélküli potenciális ügyfelek telefonos megkeresését jelenti. A létige után az alanyt megnevező vagy minősítő állítmánykiegészítő szükséges.</w:t>
       </w:r>
     </w:p>
     <w:p>
@@ -5582,7 +5582,7 @@
           <w:color w:val="555555"/>
           <w:sz w:val="18"/>
         </w:rPr>
-        <w:t>A mondat definíciója és szakmai helyzete pontosan a(z) 'customer relationship management' fogalmat írja körül; másik tétel nem illik egyszerre a jelentéshez és a nyelvtani szerkezethez.</w:t>
+        <w:t>A mondat kulcsjele: 'The systems used to record and improve a company's interactions with customers are called [hiány]'. A 'customer relationship management' itt az ügyfélkapcsolatok rögzítésére és javítására használt rendszereket jelenti. A called után a leírt jelenség nevét adó főnév vagy főnévi kifejezés szükséges.</w:t>
       </w:r>
     </w:p>
     <w:p>
@@ -5647,7 +5647,7 @@
           <w:color w:val="555555"/>
           <w:sz w:val="18"/>
         </w:rPr>
-        <w:t>A mondat definíciója és szakmai helyzete pontosan a(z) 'door-to-door selling' fogalmat írja körül; másik tétel nem illik egyszerre a jelentéshez és a nyelvtani szerkezethez.</w:t>
+        <w:t>A mondat kulcsjele: 'Visiting individual homes to offer products directly is [hiány]'. A 'door-to-door selling' itt termékek lakásról lakásra történő közvetlen értékesítését jelenti. A létige után az alanyt megnevező vagy minősítő állítmánykiegészítő szükséges.</w:t>
       </w:r>
     </w:p>
     <w:p>
@@ -5712,7 +5712,7 @@
           <w:color w:val="555555"/>
           <w:sz w:val="18"/>
         </w:rPr>
-        <w:t>A mondat definíciója és szakmai helyzete pontosan a(z) 'catalogues' fogalmat írja körül; másik tétel nem illik egyszerre a jelentéshez és a nyelvtani szerkezethez.</w:t>
+        <w:t>A mondat kulcsjele: 'Printed or digital lists showing a company's products and prices are [hiány]'. A 'catalogues' itt a vállalat termékeit és árait bemutató nyomtatott vagy digitális listákat jelenti. A többes számú alany és az are/were után többes számú megnevezés vagy állítmánykiegészítő illik.</w:t>
       </w:r>
     </w:p>
     <w:p>
@@ -5777,7 +5777,7 @@
           <w:color w:val="555555"/>
           <w:sz w:val="18"/>
         </w:rPr>
-        <w:t>A mondat definíciója és szakmai helyzete pontosan a(z) 'social media marketing' fogalmat írja körül; másik tétel nem illik egyszerre a jelentéshez és a nyelvtani szerkezethez.</w:t>
+        <w:t>A mondat kulcsjele: 'Promoting a brand through platforms such as Instagram or Facebook is [hiány]'. A 'social media marketing' itt márkák közösségi platformokon történő népszerűsítését jelenti. A létige után az alanyt megnevező vagy minősítő állítmánykiegészítő szükséges.</w:t>
       </w:r>
     </w:p>
     <w:p>
@@ -5842,7 +5842,7 @@
           <w:color w:val="555555"/>
           <w:sz w:val="18"/>
         </w:rPr>
-        <w:t>A mondat definíciója és szakmai helyzete pontosan a(z) 'text messaging' fogalmat írja körül; másik tétel nem illik egyszerre a jelentéshez és a nyelvtani szerkezethez.</w:t>
+        <w:t>A mondat kulcsjele: 'Sending an SMS promotion to a customer's phone uses [hiány]'. A 'text messaging' itt SMS-ben küldött promóciós üzenetek marketingcsatornáját jelenti. Az ige után a meghatározás tárgyát megnevező főnév vagy főnévi kifejezés szükséges.</w:t>
       </w:r>
     </w:p>
     <w:p>
@@ -5907,7 +5907,7 @@
           <w:color w:val="555555"/>
           <w:sz w:val="18"/>
         </w:rPr>
-        <w:t>A mondat definíciója és szakmai helyzete pontosan a(z) 'word-of-mouth referrals' fogalmat írja körül; másik tétel nem illik egyszerre a jelentéshez és a nyelvtani szerkezethez.</w:t>
+        <w:t>A mondat kulcsjele: 'Recommendations passed personally from satisfied customers are [hiány]'. A 'word-of-mouth referrals' itt elégedett ügyfelektől személyesen továbbadott ajánlásokat jelenti. A többes számú alany és az are/were után többes számú megnevezés vagy állítmánykiegészítő illik.</w:t>
       </w:r>
     </w:p>
     <w:p>
@@ -5972,7 +5972,7 @@
           <w:color w:val="555555"/>
           <w:sz w:val="18"/>
         </w:rPr>
-        <w:t>A mondat definíciója és szakmai helyzete pontosan a(z) 'customer experience' fogalmat írja körül; másik tétel nem illik egyszerre a jelentéshez és a nyelvtani szerkezethez.</w:t>
+        <w:t>A mondat kulcsjele: 'A buyer's complete impression of every interaction with a company is the [hiány]'. A 'customer experience' itt az ügyfél vállalattal kapcsolatos összes élményének teljes benyomását jelenti. A the névelő után a mondatban egy konkrét, azonosítható főnévi megnevezés áll.</w:t>
       </w:r>
     </w:p>
     <w:p>
@@ -6037,7 +6037,7 @@
           <w:color w:val="555555"/>
           <w:sz w:val="18"/>
         </w:rPr>
-        <w:t>A mondat definíciója és szakmai helyzete pontosan a(z) 'customer loyalty' fogalmat írja körül; másik tétel nem illik egyszerre a jelentéshez és a nyelvtani szerkezethez.</w:t>
+        <w:t>A mondat kulcsjele: 'A buyer's willingness to keep choosing the same brand is [hiány]'. A 'customer loyalty' itt az ügyfél ugyanazon márka ismételt választására való hajlandóságát jelenti. A létige után az alanyt megnevező vagy minősítő állítmánykiegészítő szükséges.</w:t>
       </w:r>
     </w:p>
     <w:p>
@@ -6102,7 +6102,7 @@
           <w:color w:val="555555"/>
           <w:sz w:val="18"/>
         </w:rPr>
-        <w:t>A mondat definíciója és szakmai helyzete pontosan a(z) 'direct mail' fogalmat írja körül; másik tétel nem illik egyszerre a jelentéshez és a nyelvtani szerkezethez.</w:t>
+        <w:t>A mondat kulcsjele: 'Advertising material sent straight to selected customers by post is [hiány]'. A 'direct mail' itt kiválasztott ügyfeleknek postán közvetlenül küldött reklámanyagot jelent. A létige után az alanyt megnevező vagy minősítő állítmánykiegészítő szükséges.</w:t>
       </w:r>
     </w:p>
     <w:p>
@@ -6167,7 +6167,7 @@
           <w:color w:val="555555"/>
           <w:sz w:val="18"/>
         </w:rPr>
-        <w:t>A mondat definíciója és szakmai helyzete pontosan a(z) 'multichannel relationship' fogalmat írja körül; másik tétel nem illik egyszerre a jelentéshez és a nyelvtani szerkezethez.</w:t>
+        <w:t>A mondat kulcsjele: 'Contact maintained with a customer through shops, email, phone and social media creates a [hiány]'. A 'multichannel relationship' itt üzleten, e-mailen, telefonon és közösségi médián át fenntartott ügyfélkapcsolatot jelent. A 'a' névelő megszámlálható, egyes számú főnevet vagy főnévi kifejezést vár.</w:t>
       </w:r>
     </w:p>
     <w:p>
@@ -6232,7 +6232,7 @@
           <w:color w:val="555555"/>
           <w:sz w:val="18"/>
         </w:rPr>
-        <w:t>A mondat definíciója és szakmai helyzete pontosan a(z) 'long-term customers' fogalmat írja körül; másik tétel nem illik egyszerre a jelentéshez és a nyelvtani szerkezethez.</w:t>
+        <w:t>A mondat kulcsjele: 'Buyers who continue purchasing from a company for many years are [hiány]'. A 'long-term customers' itt éveken át ugyanattól a vállalattól vásárló ügyfeleket jelenti. A többes számú alany és az are/were után többes számú megnevezés vagy állítmánykiegészítő illik.</w:t>
       </w:r>
     </w:p>
     <w:p>
@@ -6297,7 +6297,7 @@
           <w:color w:val="555555"/>
           <w:sz w:val="18"/>
         </w:rPr>
-        <w:t>A mondat definíciója és szakmai helyzete pontosan a(z) 'market share' fogalmat írja körül; másik tétel nem illik egyszerre a jelentéshez és a nyelvtani szerkezethez.</w:t>
+        <w:t>A mondat kulcsjele: 'The percentage of total sales in a market controlled by one company is its [hiány]'. A 'market share' itt egy vállalat részesedését jelenti az adott piac teljes értékesítéséből. A hiány helyén a mondat állítmányához illeszkedő teljes szakmai szó vagy kifejezés szükséges.</w:t>
       </w:r>
     </w:p>
     <w:p>
@@ -6362,7 +6362,7 @@
           <w:color w:val="555555"/>
           <w:sz w:val="18"/>
         </w:rPr>
-        <w:t>A mondat definíciója és szakmai helyzete pontosan a(z) 'intrusive marketing' fogalmat írja körül; másik tétel nem illik egyszerre a jelentéshez és a nyelvtani szerkezethez.</w:t>
+        <w:t>A mondat kulcsjele: 'Promotion that interrupts people or invades their privacy is [hiány]'. A 'intrusive marketing' itt az embereket megszakító vagy magánszférájukba behatoló promóciót jelenti. A létige után az alanyt megnevező vagy minősítő állítmánykiegészítő szükséges.</w:t>
       </w:r>
     </w:p>
     <w:p>
@@ -6427,7 +6427,7 @@
           <w:color w:val="555555"/>
           <w:sz w:val="18"/>
         </w:rPr>
-        <w:t>A mondat definíciója és szakmai helyzete pontosan a(z) 'brand awareness' fogalmat írja körül; másik tétel nem illik egyszerre a jelentéshez és a nyelvtani szerkezethez.</w:t>
+        <w:t>A mondat kulcsjele: 'The degree to which consumers recognise and remember a brand is [hiány]'. A 'brand awareness' itt annak mértékét jelenti, mennyire ismerik fel és jegyzik meg a fogyasztók a márkát. A létige után az alanyt megnevező vagy minősítő állítmánykiegészítő szükséges.</w:t>
       </w:r>
     </w:p>
     <w:p>
@@ -6492,7 +6492,7 @@
           <w:color w:val="555555"/>
           <w:sz w:val="18"/>
         </w:rPr>
-        <w:t>A mondat definíciója és szakmai helyzete pontosan a(z) 'customer profile' fogalmat írja körül; másik tétel nem illik egyszerre a jelentéshez és a nyelvtani szerkezethez.</w:t>
+        <w:t>A mondat kulcsjele: 'A description of a typical buyer's age, needs, income and behaviour is a [hiány]'. A 'customer profile' itt egy tipikus vásárló korát, igényeit, jövedelmét és viselkedését leíró profilt jelent. A 'a' névelő megszámlálható, egyes számú főnevet vagy főnévi kifejezést vár.</w:t>
       </w:r>
     </w:p>
     <w:p>
@@ -6557,7 +6557,7 @@
           <w:color w:val="555555"/>
           <w:sz w:val="18"/>
         </w:rPr>
-        <w:t>A mondat definíciója és szakmai helyzete pontosan a(z) 'product line' fogalmat írja körül; másik tétel nem illik egyszerre a jelentéshez és a nyelvtani szerkezethez.</w:t>
+        <w:t>A mondat kulcsjele: 'A related group of products sold under one company or brand is a [hiány]'. A 'product line' itt egy vállalat vagy márka egymással összefüggő termékeinek csoportját jelenti. A 'a' névelő megszámlálható, egyes számú főnevet vagy főnévi kifejezést vár.</w:t>
       </w:r>
     </w:p>
     <w:p>
@@ -6622,7 +6622,7 @@
           <w:color w:val="555555"/>
           <w:sz w:val="18"/>
         </w:rPr>
-        <w:t>A mondat definíciója és szakmai helyzete pontosan a(z) 'product endorsements' fogalmat írja körül; másik tétel nem illik egyszerre a jelentéshez és a nyelvtani szerkezethez.</w:t>
+        <w:t>A mondat kulcsjele: 'Public recommendations of a product by celebrities or experts are [hiány]'. A 'product endorsements' itt hírességek vagy szakértők nyilvános termékajánlásait jelenti. A többes számú alany és az are/were után többes számú megnevezés vagy állítmánykiegészítő illik.</w:t>
       </w:r>
     </w:p>
     <w:p>
@@ -6687,7 +6687,7 @@
           <w:color w:val="555555"/>
           <w:sz w:val="18"/>
         </w:rPr>
-        <w:t>A mondat definíciója és szakmai helyzete pontosan a(z) 'marketing mix' fogalmat írja körül; másik tétel nem illik egyszerre a jelentéshez és a nyelvtani szerkezethez.</w:t>
+        <w:t>A mondat kulcsjele: 'The coordinated combination of product, price, place and promotion is the [hiány]'. A 'marketing mix' itt a termék, ár, értékesítési hely és promóció összehangolt kombinációját jelenti. A the névelő után a mondatban egy konkrét, azonosítható főnévi megnevezés áll.</w:t>
       </w:r>
     </w:p>
     <w:p>
@@ -6752,7 +6752,7 @@
           <w:color w:val="555555"/>
           <w:sz w:val="18"/>
         </w:rPr>
-        <w:t>A mondat definíciója és szakmai helyzete pontosan a(z) 'consumer behavior' fogalmat írja körül; másik tétel nem illik egyszerre a jelentéshez és a nyelvtani szerkezethez.</w:t>
+        <w:t>A mondat kulcsjele: 'The study of how and why people choose, buy and use products is [hiány]'. A 'consumer behavior' itt annak vizsgálatát jelenti, hogyan és miért választanak, vásárolnak és használnak termékeket az emberek. A létige után az alanyt megnevező vagy minősítő állítmánykiegészítő szükséges.</w:t>
       </w:r>
     </w:p>
     <w:p>
@@ -6817,7 +6817,7 @@
           <w:color w:val="555555"/>
           <w:sz w:val="18"/>
         </w:rPr>
-        <w:t>A mondat definíciója és szakmai helyzete pontosan a(z) 'consumer resistance' fogalmat írja körül; másik tétel nem illik egyszerre a jelentéshez és a nyelvtani szerkezethez.</w:t>
+        <w:t>A mondat kulcsjele: 'Customers' reluctance or refusal to accept a new product is [hiány]'. A 'consumer resistance' itt a vásárlók új termékkel szembeni vonakodását vagy elutasítását jelenti. A létige után az alanyt megnevező vagy minősítő állítmánykiegészítő szükséges.</w:t>
       </w:r>
     </w:p>
     <w:p>
@@ -6882,7 +6882,7 @@
           <w:color w:val="555555"/>
           <w:sz w:val="18"/>
         </w:rPr>
-        <w:t>A mondat definíciója és szakmai helyzete pontosan a(z) 'viral marketing' fogalmat írja körül; másik tétel nem illik egyszerre a jelentéshez és a nyelvtani szerkezethez.</w:t>
+        <w:t>A mondat kulcsjele: 'A campaign designed to spread rapidly as users share its content is [hiány]'. A 'viral marketing' itt felhasználói megosztásokkal gyors terjedésre tervezett kampányt jelent. A létige után az alanyt megnevező vagy minősítő állítmánykiegészítő szükséges.</w:t>
       </w:r>
     </w:p>
     <w:p>
@@ -6947,7 +6947,7 @@
           <w:color w:val="555555"/>
           <w:sz w:val="18"/>
         </w:rPr>
-        <w:t>A mondat definíciója és szakmai helyzete pontosan a(z) 'consumer spending' fogalmat írja körül; másik tétel nem illik egyszerre a jelentéshez és a nyelvtani szerkezethez.</w:t>
+        <w:t>A mondat kulcsjele: 'The total amount households pay for goods and services is [hiány]'. A 'consumer spending' itt a háztartások árukra és szolgáltatásokra fordított teljes kiadását jelenti. A létige után az alanyt megnevező vagy minősítő állítmánykiegészítő szükséges.</w:t>
       </w:r>
     </w:p>
     <w:p>
@@ -7012,7 +7012,7 @@
           <w:color w:val="555555"/>
           <w:sz w:val="18"/>
         </w:rPr>
-        <w:t>A mondat definíciója és szakmai helyzete pontosan a(z) 'earnings gap' fogalmat írja körül; másik tétel nem illik egyszerre a jelentéshez és a nyelvtani szerkezethez.</w:t>
+        <w:t>A mondat kulcsjele: 'The difference between the income of two groups is an [hiány]'. A 'earnings gap' itt két csoport jövedelme közötti különbséget jelenti. A 'an' névelő megszámlálható, egyes számú főnevet vagy főnévi kifejezést vár.</w:t>
       </w:r>
     </w:p>
     <w:p>
@@ -7077,7 +7077,7 @@
           <w:color w:val="555555"/>
           <w:sz w:val="18"/>
         </w:rPr>
-        <w:t>A mondat definíciója és szakmai helyzete pontosan a(z) 'mass market' fogalmat írja körül; másik tétel nem illik egyszerre a jelentéshez és a nyelvtani szerkezethez.</w:t>
+        <w:t>A mondat kulcsjele: 'A very large group of ordinary consumers rather than a narrow segment is the [hiány]'. A 'mass market' itt a hétköznapi fogyasztók nagyon nagy, nem szűk szegmensét jelenti. A the névelő után a mondatban egy konkrét, azonosítható főnévi megnevezés áll.</w:t>
       </w:r>
     </w:p>
     <w:p>
@@ -7142,7 +7142,7 @@
           <w:color w:val="555555"/>
           <w:sz w:val="18"/>
         </w:rPr>
-        <w:t>A mondat definíciója és szakmai helyzete pontosan a(z) 'target market' fogalmat írja körül; másik tétel nem illik egyszerre a jelentéshez és a nyelvtani szerkezethez.</w:t>
+        <w:t>A mondat kulcsjele: 'The specific group of customers a campaign aims to reach is its [hiány]'. A 'target market' itt azt a konkrét vásárlói csoportot jelenti, amelyet a kampány el akar érni. A hiány helyén a mondat állítmányához illeszkedő teljes szakmai szó vagy kifejezés szükséges.</w:t>
       </w:r>
     </w:p>
     <w:p>
@@ -7207,7 +7207,7 @@
           <w:color w:val="555555"/>
           <w:sz w:val="18"/>
         </w:rPr>
-        <w:t>A mondat definíciója és szakmai helyzete pontosan a(z) 'strapline' fogalmat írja körül; másik tétel nem illik egyszerre a jelentéshez és a nyelvtani szerkezethez.</w:t>
+        <w:t>A mondat kulcsjele: 'A short memorable phrase placed next to a brand name is a [hiány]'. A 'strapline' itt a márkanév mellett használt rövid és könnyen megjegyezhető jelmondatot jelenti. A 'a' névelő megszámlálható, egyes számú főnevet vagy főnévi kifejezést vár.</w:t>
       </w:r>
     </w:p>
     <w:p>
@@ -7272,7 +7272,7 @@
           <w:color w:val="555555"/>
           <w:sz w:val="18"/>
         </w:rPr>
-        <w:t>A mondat definíciója és szakmai helyzete pontosan a(z) 'press release' fogalmat írja körül; másik tétel nem illik egyszerre a jelentéshez és a nyelvtani szerkezethez.</w:t>
+        <w:t>A mondat kulcsjele: 'An official written announcement supplied to journalists is a [hiány]'. A 'press release' itt újságíróknak kiadott hivatalos írásbeli közleményt jelent. A 'a' névelő megszámlálható, egyes számú főnevet vagy főnévi kifejezést vár.</w:t>
       </w:r>
     </w:p>
     <w:p>
@@ -7337,7 +7337,7 @@
           <w:color w:val="555555"/>
           <w:sz w:val="18"/>
         </w:rPr>
-        <w:t>A mondat definíciója és szakmai helyzete pontosan a(z) 'campaign' fogalmat írja körül; másik tétel nem illik egyszerre a jelentéshez és a nyelvtani szerkezethez.</w:t>
+        <w:t>A mondat kulcsjele: 'A coordinated series of promotional activities with one objective is a [hiány]'. A 'campaign' itt egy cél érdekében összehangolt promóciós tevékenységek sorozatát jelenti. A 'a' névelő megszámlálható, egyes számú főnevet vagy főnévi kifejezést vár.</w:t>
       </w:r>
     </w:p>
     <w:p>
@@ -7402,7 +7402,7 @@
           <w:color w:val="555555"/>
           <w:sz w:val="18"/>
         </w:rPr>
-        <w:t>A mondat definíciója és szakmai helyzete pontosan a(z) 'publicity' fogalmat írja körül; másik tétel nem illik egyszerre a jelentéshez és a nyelvtani szerkezethez.</w:t>
+        <w:t>A mondat kulcsjele: 'Public attention generated through media coverage rather than paid advertising is [hiány]'. A 'publicity' itt fizetett hirdetés helyett médiamegjelenésből származó nyilvános figyelmet jelent. A létige után az alanyt megnevező vagy minősítő állítmánykiegészítő szükséges.</w:t>
       </w:r>
     </w:p>
     <w:p>
@@ -7475,7 +7475,7 @@
           <w:color w:val="555555"/>
           <w:sz w:val="18"/>
         </w:rPr>
-        <w:t>A mondat definíciója és szakmai helyzete pontosan a(z) 'rise' fogalmat írja körül; másik tétel nem illik egyszerre a jelentéshez és a nyelvtani szerkezethez.</w:t>
+        <w:t>A mondat kulcsjele: 'The noun for a neutral upward movement, whose verb has the past form 'rose', is a [hiány]'. A 'rise' itt semleges felfelé irányuló mozgást jelent főnévként, igei múlt ideje rose. A 'a' névelő megszámlálható, egyes számú főnevet vagy főnévi kifejezést vár.</w:t>
       </w:r>
     </w:p>
     <w:p>
@@ -7540,7 +7540,7 @@
           <w:color w:val="555555"/>
           <w:sz w:val="18"/>
         </w:rPr>
-        <w:t>A mondat definíciója és szakmai helyzete pontosan a(z) 'increase' fogalmat írja körül; másik tétel nem illik egyszerre a jelentéshez és a nyelvtani szerkezethez.</w:t>
+        <w:t>A mondat kulcsjele: 'The graph word used as both a verb and a noun for an upward change of 10% is [hiány]'. A 'increase' itt növekedést jelent, és grafikonleírásban főnévként és igeként is használható. A létige után az alanyt megnevező vagy minősítő állítmánykiegészítő szükséges.</w:t>
       </w:r>
     </w:p>
     <w:p>
@@ -7605,7 +7605,7 @@
           <w:color w:val="555555"/>
           <w:sz w:val="18"/>
         </w:rPr>
-        <w:t>A mondat definíciója és szakmai helyzete pontosan a(z) 'grow' fogalmat írja körül; másik tétel nem illik egyszerre a jelentéshez és a nyelvtani szerkezethez.</w:t>
+        <w:t>A mondat kulcsjele: 'The irregular graph verb whose noun form is 'growth' is [hiány]'. A 'grow' itt növekedést kifejező rendhagyó igét jelenti, főnévi alakja growth. A létige után az alanyt megnevező vagy minősítő állítmánykiegészítő szükséges.</w:t>
       </w:r>
     </w:p>
     <w:p>
@@ -7670,7 +7670,7 @@
           <w:color w:val="555555"/>
           <w:sz w:val="18"/>
         </w:rPr>
-        <w:t>A mondat definíciója és szakmai helyzete pontosan a(z) 'climb' fogalmat írja körül; másik tétel nem illik egyszerre a jelentéshez és a nyelvtani szerkezethez.</w:t>
+        <w:t>A mondat kulcsjele: 'When a share price moves upward steadily as if going up a hill, it begins to [hiány]'. A 'climb' itt folyamatos, lépcsőzetes felfelé mozgást jelent. A hiány előtt álló to után alapigei alak vagy teljes igei kifejezés szükséges.</w:t>
       </w:r>
     </w:p>
     <w:p>
@@ -7735,7 +7735,7 @@
           <w:color w:val="555555"/>
           <w:sz w:val="18"/>
         </w:rPr>
-        <w:t>A mondat definíciója és szakmai helyzete pontosan a(z) 'shoot up' fogalmat írja körül; másik tétel nem illik egyszerre a jelentéshez és a nyelvtani szerkezethez.</w:t>
+        <w:t>A mondat kulcsjele: 'When sales rise extremely quickly like a projectile, they [hiány]'. A 'shoot up' itt nagyon gyors és meredek emelkedést jelent. A hiány helyén a mondat állítmányához illeszkedő teljes szakmai szó vagy kifejezés szükséges.</w:t>
       </w:r>
     </w:p>
     <w:p>
@@ -7800,7 +7800,7 @@
           <w:color w:val="555555"/>
           <w:sz w:val="18"/>
         </w:rPr>
-        <w:t>A mondat definíciója és szakmai helyzete pontosan a(z) 'pick up' fogalmat írja körül; másik tétel nem illik egyszerre a jelentéshez és a nyelvtani szerkezethez.</w:t>
+        <w:t>A mondat kulcsjele: 'After a weak month, sales that begin to improve again [hiány]'. A 'pick up' itt gyenge időszak után újrainduló javulást vagy élénkülést jelent. A hiány helyén a mondat állítmányához illeszkedő teljes szakmai szó vagy kifejezés szükséges.</w:t>
       </w:r>
     </w:p>
     <w:p>
@@ -7865,7 +7865,7 @@
           <w:color w:val="555555"/>
           <w:sz w:val="18"/>
         </w:rPr>
-        <w:t>A mondat definíciója és szakmai helyzete pontosan a(z) 'recover' fogalmat írja körül; másik tétel nem illik egyszerre a jelentéshez és a nyelvtani szerkezethez.</w:t>
+        <w:t>A mondat kulcsjele: 'After a fall, returning towards the previous level means to [hiány]'. A 'recover' itt esés után a korábbi szint felé történő visszatérést jelenti. A hiány előtt álló to után alapigei alak vagy teljes igei kifejezés szükséges.</w:t>
       </w:r>
     </w:p>
     <w:p>
@@ -7930,7 +7930,7 @@
           <w:color w:val="555555"/>
           <w:sz w:val="18"/>
         </w:rPr>
-        <w:t>A mondat definíciója és szakmai helyzete pontosan a(z) 'fall' fogalmat írja körül; másik tétel nem illik egyszerre a jelentéshez és a nyelvtani szerkezethez.</w:t>
+        <w:t>A mondat kulcsjele: 'The neutral irregular downward verb with the past form 'fell' is [hiány]'. A 'fall' itt semleges lefelé mozgást jelent, rendhagyó múlt ideje fell. A létige után az alanyt megnevező vagy minősítő állítmánykiegészítő szükséges.</w:t>
       </w:r>
     </w:p>
     <w:p>
@@ -7995,7 +7995,7 @@
           <w:color w:val="555555"/>
           <w:sz w:val="18"/>
         </w:rPr>
-        <w:t>A mondat definíciója és szakmai helyzete pontosan a(z) 'drop' fogalmat írja körül; másik tétel nem illik egyszerre a jelentéshez és a nyelvtani szerkezethez.</w:t>
+        <w:t>A mondat kulcsjele: 'A neutral graph verb that also means to let something move down is [hiány]'. A 'drop' itt semleges lefelé mozgást vagy csökkenést jelent. A létige után az alanyt megnevező vagy minősítő állítmánykiegészítő szükséges.</w:t>
       </w:r>
     </w:p>
     <w:p>
@@ -8060,7 +8060,7 @@
           <w:color w:val="555555"/>
           <w:sz w:val="18"/>
         </w:rPr>
-        <w:t>A mondat definíciója és szakmai helyzete pontosan a(z) 'decline' fogalmat írja körül; másik tétel nem illik egyszerre a jelentéshez és a nyelvtani szerkezethez.</w:t>
+        <w:t>A mondat kulcsjele: 'A formal verb or noun for a continuing downward movement is [hiány]'. A 'decline' itt tartós lefelé mozgás formális igei és főnévi megnevezése. A létige után az alanyt megnevező vagy minősítő állítmánykiegészítő szükséges.</w:t>
       </w:r>
     </w:p>
     <w:p>
@@ -8125,7 +8125,7 @@
           <w:color w:val="555555"/>
           <w:sz w:val="18"/>
         </w:rPr>
-        <w:t>A mondat definíciója és szakmai helyzete pontosan a(z) 'decrease' fogalmat írja körül; másik tétel nem illik egyszerre a jelentéshez és a nyelvtani szerkezethez.</w:t>
+        <w:t>A mondat kulcsjele: 'The direct opposite of 'increase' in graph language is [hiány]'. A 'decrease' itt az increase közvetlen ellentéteként csökkenést jelent. A létige után az alanyt megnevező vagy minősítő állítmánykiegészítő szükséges.</w:t>
       </w:r>
     </w:p>
     <w:p>
@@ -8190,7 +8190,7 @@
           <w:color w:val="555555"/>
           <w:sz w:val="18"/>
         </w:rPr>
-        <w:t>A mondat definíciója és szakmai helyzete pontosan a(z) 'slide' fogalmat írja körül; másik tétel nem illik egyszerre a jelentéshez és a nyelvtani szerkezethez.</w:t>
+        <w:t>A mondat kulcsjele: 'A slow, smooth downward movement in prices is a [hiány]'. A 'slide' itt lassú, egyenletes lefelé mozgást jelent. A 'a' névelő megszámlálható, egyes számú főnevet vagy főnévi kifejezést vár.</w:t>
       </w:r>
     </w:p>
     <w:p>
@@ -8255,7 +8255,7 @@
           <w:color w:val="555555"/>
           <w:sz w:val="18"/>
         </w:rPr>
-        <w:t>A mondat definíciója és szakmai helyzete pontosan a(z) 'dip' fogalmat írja körül; másik tétel nem illik egyszerre a jelentéshez és a nyelvtani szerkezethez.</w:t>
+        <w:t>A mondat kulcsjele: 'A small temporary fall followed by recovery is a [hiány]'. A 'dip' itt kicsi, átmeneti, majd helyreálló visszaesést jelent. A 'a' névelő megszámlálható, egyes számú főnevet vagy főnévi kifejezést vár.</w:t>
       </w:r>
     </w:p>
     <w:p>
@@ -8320,7 +8320,7 @@
           <w:color w:val="555555"/>
           <w:sz w:val="18"/>
         </w:rPr>
-        <w:t>A mondat definíciója és szakmai helyzete pontosan a(z) 'plunge' fogalmat írja körül; másik tétel nem illik egyszerre a jelentéshez és a nyelvtani szerkezethez.</w:t>
+        <w:t>A mondat kulcsjele: 'A sudden, very steep fall in value is to [hiány]'. A 'plunge' itt hirtelen és nagyon meredek zuhanást jelent. A hiány előtt álló to után alapigei alak vagy teljes igei kifejezés szükséges.</w:t>
       </w:r>
     </w:p>
     <w:p>
@@ -8385,7 +8385,7 @@
           <w:color w:val="555555"/>
           <w:sz w:val="18"/>
         </w:rPr>
-        <w:t>A mondat definíciója és szakmai helyzete pontosan a(z) 'plummet' fogalmat írja körül; másik tétel nem illik egyszerre a jelentéshez és a nyelvtani szerkezethez.</w:t>
+        <w:t>A mondat kulcsjele: 'To fall extremely fast, like a heavy object dropping vertically, is to [hiány]'. A 'plummet' itt rendkívül gyors, szinte függőleges esést jelent. A hiány előtt álló to után alapigei alak vagy teljes igei kifejezés szükséges.</w:t>
       </w:r>
     </w:p>
     <w:p>
@@ -8450,7 +8450,7 @@
           <w:color w:val="555555"/>
           <w:sz w:val="18"/>
         </w:rPr>
-        <w:t>A mondat definíciója és szakmai helyzete pontosan a(z) 'nosedive' fogalmat írja körül; másik tétel nem illik egyszerre a jelentéshez és a nyelvtani szerkezethez.</w:t>
+        <w:t>A mondat kulcsjele: 'The aviation metaphor used for a dramatic fall in share price is [hiány]'. A 'nosedive' itt drámai árfolyamesést kifejező repülési metafora. A létige után az alanyt megnevező vagy minősítő állítmánykiegészítő szükséges.</w:t>
       </w:r>
     </w:p>
     <w:p>
@@ -8515,7 +8515,7 @@
           <w:color w:val="555555"/>
           <w:sz w:val="18"/>
         </w:rPr>
-        <w:t>A mondat definíciója és szakmai helyzete pontosan a(z) 'bottom out' fogalmat írja körül; másik tétel nem illik egyszerre a jelentéshez és a nyelvtani szerkezethez.</w:t>
+        <w:t>A mondat kulcsjele: 'When a falling figure reaches its lowest point and stops declining, it [hiány]'. A 'bottom out' itt a csökkenés mélypontjának elérését és megállását jelenti. A hiány helyén a mondat állítmányához illeszkedő teljes szakmai szó vagy kifejezés szükséges.</w:t>
       </w:r>
     </w:p>
     <w:p>
@@ -8580,7 +8580,7 @@
           <w:color w:val="555555"/>
           <w:sz w:val="18"/>
         </w:rPr>
-        <w:t>A mondat definíciója és szakmai helyzete pontosan a(z) 'level off' fogalmat írja körül; másik tétel nem illik egyszerre a jelentéshez és a nyelvtani szerkezethez.</w:t>
+        <w:t>A mondat kulcsjele: 'When a rising or falling line becomes flat, it begins to [hiány]'. A 'level off' itt az emelkedő vagy csökkenő görbe ellaposodását jelenti. A hiány előtt álló to után alapigei alak vagy teljes igei kifejezés szükséges.</w:t>
       </w:r>
     </w:p>
     <w:p>
@@ -8645,7 +8645,7 @@
           <w:color w:val="555555"/>
           <w:sz w:val="18"/>
         </w:rPr>
-        <w:t>A mondat definíciója és szakmai helyzete pontosan a(z) 'fluctuate' fogalmat írja körül; másik tétel nem illik egyszerre a jelentéshez és a nyelvtani szerkezethez.</w:t>
+        <w:t>A mondat kulcsjele: 'To move repeatedly up and down between different values is to [hiány]'. A 'fluctuate' itt különböző értékek közötti ismétlődő fel-le mozgást jelent. A hiány előtt álló to után alapigei alak vagy teljes igei kifejezés szükséges.</w:t>
       </w:r>
     </w:p>
     <w:p>
@@ -8710,7 +8710,7 @@
           <w:color w:val="555555"/>
           <w:sz w:val="18"/>
         </w:rPr>
-        <w:t>A mondat definíciója és szakmai helyzete pontosan a(z) 'peak' fogalmat írja körül; másik tétel nem illik egyszerre a jelentéshez és a nyelvtani szerkezethez.</w:t>
+        <w:t>A mondat kulcsjele: 'When sales reach their single highest value, they [hiány]'. A 'peak' itt egyetlen legmagasabb érték elérését jelenti. A hiány helyén a mondat állítmányához illeszkedő teljes szakmai szó vagy kifejezés szükséges.</w:t>
       </w:r>
     </w:p>
     <w:p>
@@ -8775,7 +8775,7 @@
           <w:color w:val="555555"/>
           <w:sz w:val="18"/>
         </w:rPr>
-        <w:t>A mondat definíciója és szakmai helyzete pontosan a(z) 'reach a peak' fogalmat írja körül; másik tétel nem illik egyszerre a jelentéshez és a nyelvtani szerkezethez.</w:t>
+        <w:t>A mondat kulcsjele: 'Analysts expect demand to [hiány] in July before it declines'. A 'reach a peak' itt a csúcsérték elérésének teljes igei kifejezése. A hiány előtt álló to után alapigei alak vagy teljes igei kifejezés szükséges.</w:t>
       </w:r>
     </w:p>
     <w:p>
@@ -8840,7 +8840,7 @@
           <w:color w:val="555555"/>
           <w:sz w:val="18"/>
         </w:rPr>
-        <w:t>A mondat definíciója és szakmai helyzete pontosan a(z) 'hit an all-time low' fogalmat írja körül; másik tétel nem illik egyszerre a jelentéshez és a nyelvtani szerkezethez.</w:t>
+        <w:t>A mondat kulcsjele: 'When a share price falls to its lowest value ever recorded, it may [hiány]'. A 'hit an all-time low' itt a valaha mért legalacsonyabb érték elérését jelenti. A módbeli segédige után ragozatlan alapige vagy teljes igei kifejezés szükséges.</w:t>
       </w:r>
     </w:p>
     <w:p>
@@ -8905,7 +8905,7 @@
           <w:color w:val="555555"/>
           <w:sz w:val="18"/>
         </w:rPr>
-        <w:t>A mondat definíciója és szakmai helyzete pontosan a(z) 'skyrocket' fogalmat írja körül; másik tétel nem illik egyszerre a jelentéshez és a nyelvtani szerkezethez.</w:t>
+        <w:t>A mondat kulcsjele: 'A value that rises with exceptional speed, like a rocket, begins to [hiány]'. A 'skyrocket' itt rakétaszerű, kivételesen gyors emelkedést jelent. A hiány előtt álló to után alapigei alak vagy teljes igei kifejezés szükséges.</w:t>
       </w:r>
     </w:p>
     <w:p>
@@ -8970,7 +8970,7 @@
           <w:color w:val="555555"/>
           <w:sz w:val="18"/>
         </w:rPr>
-        <w:t>A mondat definíciója és szakmai helyzete pontosan a(z) 'soar' fogalmat írja körül; másik tétel nem illik egyszerre a jelentéshez és a nyelvtani szerkezethez.</w:t>
+        <w:t>A mondat kulcsjele: 'A price that rises high and rapidly, like a bird in flight, begins to [hiány]'. A 'soar' itt magasra és gyorsan történő emelkedést jelent. A hiány előtt álló to után alapigei alak vagy teljes igei kifejezés szükséges.</w:t>
       </w:r>
     </w:p>
     <w:p>
@@ -9035,7 +9035,7 @@
           <w:color w:val="555555"/>
           <w:sz w:val="18"/>
         </w:rPr>
-        <w:t>A mondat definíciója és szakmai helyzete pontosan a(z) 'jump' fogalmat írja körül; másik tétel nem illik egyszerre a jelentéshez és a nyelvtani szerkezethez.</w:t>
+        <w:t>A mondat kulcsjele: 'A sudden single-step rise from one value to another is to [hiány]'. A 'jump' itt egy hirtelen, egyetlen lépésben bekövetkező emelkedést jelent. A hiány előtt álló to után alapigei alak vagy teljes igei kifejezés szükséges.</w:t>
       </w:r>
     </w:p>
     <w:p>
@@ -9100,7 +9100,7 @@
           <w:color w:val="555555"/>
           <w:sz w:val="18"/>
         </w:rPr>
-        <w:t>A mondat definíciója és szakmai helyzete pontosan a(z) 'remain stable' fogalmat írja körül; másik tétel nem illik egyszerre a jelentéshez és a nyelvtani szerkezethez.</w:t>
+        <w:t>A mondat kulcsjele: 'A figure that stays unchanged throughout the whole period will [hiány]'. A 'remain stable' itt az érték teljes időszak alatti változatlanságát jelenti. A módbeli segédige után ragozatlan alapige vagy teljes igei kifejezés szükséges.</w:t>
       </w:r>
     </w:p>
     <w:p>
@@ -9165,7 +9165,7 @@
           <w:color w:val="555555"/>
           <w:sz w:val="18"/>
         </w:rPr>
-        <w:t>A mondat definíciója és szakmai helyzete pontosan a(z) 'stabilise' fogalmat írja körül; másik tétel nem illik egyszerre a jelentéshez és a nyelvtani szerkezethez.</w:t>
+        <w:t>A mondat kulcsjele: 'After several fluctuations, a figure that becomes steady begins to [hiány]'. A 'stabilise' itt ingadozás után bekövetkező állandósulást jelent. A hiány előtt álló to után alapigei alak vagy teljes igei kifejezés szükséges.</w:t>
       </w:r>
     </w:p>
     <w:p>
@@ -9238,7 +9238,7 @@
           <w:color w:val="555555"/>
           <w:sz w:val="18"/>
         </w:rPr>
-        <w:t>A mondat definíciója és szakmai helyzete pontosan a(z) 'substantial' fogalmat írja körül; másik tétel nem illik egyszerre a jelentéshez és a nyelvtani szerkezethez.</w:t>
+        <w:t>A mondat kulcsjele: 'A large and important increase, but not necessarily an extreme one, is [hiány]'. A 'substantial' itt nagy és jelentős, de nem feltétlenül szélsőséges változást jelöl. A létige után az alanyt megnevező vagy minősítő állítmánykiegészítő szükséges.</w:t>
       </w:r>
     </w:p>
     <w:p>
@@ -9303,7 +9303,7 @@
           <w:color w:val="555555"/>
           <w:sz w:val="18"/>
         </w:rPr>
-        <w:t>A mondat definíciója és szakmai helyzete pontosan a(z) 'rapid' fogalmat írja körül; másik tétel nem illik egyszerre a jelentéshez és a nyelvtani szerkezethez.</w:t>
+        <w:t>A mondat kulcsjele: 'A change that happens in a very short time is [hiány]'. A 'rapid' itt nagyon rövid idő alatt bekövetkező változást jelöl. A létige után az alanyt megnevező vagy minősítő állítmánykiegészítő szükséges.</w:t>
       </w:r>
     </w:p>
     <w:p>
@@ -9368,7 +9368,7 @@
           <w:color w:val="555555"/>
           <w:sz w:val="18"/>
         </w:rPr>
-        <w:t>A mondat definíciója és szakmai helyzete pontosan a(z) 'encouraging' fogalmat írja körül; másik tétel nem illik egyszerre a jelentéshez és a nyelvtani szerkezethez.</w:t>
+        <w:t>A mondat kulcsjele: 'A positive sales movement that gives reason for confidence is [hiány]'. A 'encouraging' itt bizakodásra okot adó kedvező változást jelöl. A létige után az alanyt megnevező vagy minősítő állítmánykiegészítő szükséges.</w:t>
       </w:r>
     </w:p>
     <w:p>
@@ -9433,7 +9433,7 @@
           <w:color w:val="555555"/>
           <w:sz w:val="18"/>
         </w:rPr>
-        <w:t>A mondat definíciója és szakmai helyzete pontosan a(z) 'slight' fogalmat írja körül; másik tétel nem illik egyszerre a jelentéshez és a nyelvtani szerkezethez.</w:t>
+        <w:t>A mondat kulcsjele: 'A very small change in a figure is [hiány]'. A 'slight' itt nagyon kis mértékű változást jelöl. A létige után az alanyt megnevező vagy minősítő állítmánykiegészítő szükséges.</w:t>
       </w:r>
     </w:p>
     <w:p>
@@ -9498,7 +9498,7 @@
           <w:color w:val="555555"/>
           <w:sz w:val="18"/>
         </w:rPr>
-        <w:t>A mondat definíciója és szakmai helyzete pontosan a(z) 'spectacular' fogalmat írja körül; másik tétel nem illik egyszerre a jelentéshez és a nyelvtani szerkezethez.</w:t>
+        <w:t>A mondat kulcsjele: 'An exceptionally impressive rise in performance is [hiány]'. A 'spectacular' itt kivételesen látványos és lenyűgöző emelkedést jelöl. A létige után az alanyt megnevező vagy minősítő állítmánykiegészítő szükséges.</w:t>
       </w:r>
     </w:p>
     <w:p>
@@ -9563,7 +9563,7 @@
           <w:color w:val="555555"/>
           <w:sz w:val="18"/>
         </w:rPr>
-        <w:t>A mondat definíciója és szakmai helyzete pontosan a(z) 'disastrous' fogalmat írja körül; másik tétel nem illik egyszerre a jelentéshez és a nyelvtani szerkezethez.</w:t>
+        <w:t>A mondat kulcsjele: 'A collapse with extremely harmful business consequences is [hiány]'. A 'disastrous' itt rendkívül káros üzleti következményekkel járó összeomlást jelöl. A létige után az alanyt megnevező vagy minősítő állítmánykiegészítő szükséges.</w:t>
       </w:r>
     </w:p>
     <w:p>
@@ -9628,7 +9628,7 @@
           <w:color w:val="555555"/>
           <w:sz w:val="18"/>
         </w:rPr>
-        <w:t>A mondat definíciója és szakmai helyzete pontosan a(z) 'moderate' fogalmat írja körül; másik tétel nem illik egyszerre a jelentéshez és a nyelvtani szerkezethez.</w:t>
+        <w:t>A mondat kulcsjele: 'A change that is neither small nor very large is [hiány]'. A 'moderate' itt közepes, sem nem kicsi, sem nem nagyon nagy változást jelöl. A létige után az alanyt megnevező vagy minősítő állítmánykiegészítő szükséges.</w:t>
       </w:r>
     </w:p>
     <w:p>
@@ -9693,7 +9693,7 @@
           <w:color w:val="555555"/>
           <w:sz w:val="18"/>
         </w:rPr>
-        <w:t>A mondat definíciója és szakmai helyzete pontosan a(z) 'disappointing' fogalmat írja körül; másik tétel nem illik egyszerre a jelentéshez és a nyelvtani szerkezethez.</w:t>
+        <w:t>A mondat kulcsjele: 'A result that falls below expectations is [hiány]'. A 'disappointing' itt az elvárásoktól elmaradó eredményt jelöl. A létige után az alanyt megnevező vagy minősítő állítmánykiegészítő szükséges.</w:t>
       </w:r>
     </w:p>
     <w:p>
@@ -9758,7 +9758,7 @@
           <w:color w:val="555555"/>
           <w:sz w:val="18"/>
         </w:rPr>
-        <w:t>A mondat definíciója és szakmai helyzete pontosan a(z) 'steady' fogalmat írja körül; másik tétel nem illik egyszerre a jelentéshez és a nyelvtani szerkezethez.</w:t>
+        <w:t>A mondat kulcsjele: 'A movement that continues at a consistent rate without sudden changes is [hiány]'. A 'steady' itt hirtelen változások nélküli, egyenletes ütemű mozgást jelöl. A létige után az alanyt megnevező vagy minősítő állítmánykiegészítő szükséges.</w:t>
       </w:r>
     </w:p>
     <w:p>
@@ -9823,7 +9823,7 @@
           <w:color w:val="555555"/>
           <w:sz w:val="18"/>
         </w:rPr>
-        <w:t>A mondat definíciója és szakmai helyzete pontosan a(z) 'enormous' fogalmat írja körül; másik tétel nem illik egyszerre a jelentéshez és a nyelvtani szerkezethez.</w:t>
+        <w:t>A mondat kulcsjele: 'An exceptionally large difference between two values is [hiány]'. A 'enormous' itt kivételesen nagy értékkülönbséget jelöl. A létige után az alanyt megnevező vagy minősítő állítmánykiegészítő szükséges.</w:t>
       </w:r>
     </w:p>
     <w:p>
@@ -9888,7 +9888,7 @@
           <w:color w:val="555555"/>
           <w:sz w:val="18"/>
         </w:rPr>
-        <w:t>A mondat definíciója és szakmai helyzete pontosan a(z) 'sharp' fogalmat írja körül; másik tétel nem illik egyszerre a jelentéshez és a nyelvtani szerkezethez.</w:t>
+        <w:t>A mondat kulcsjele: 'A clearly defined and abrupt movement on a graph is [hiány]'. A 'sharp' itt egyértelműen kirajzolódó, hirtelen grafikonmozgást jelöl. A létige után az alanyt megnevező vagy minősítő állítmánykiegészítő szükséges.</w:t>
       </w:r>
     </w:p>
     <w:p>
@@ -9953,7 +9953,7 @@
           <w:color w:val="555555"/>
           <w:sz w:val="18"/>
         </w:rPr>
-        <w:t>A mondat definíciója és szakmai helyzete pontosan a(z) 'dramatic' fogalmat írja körül; másik tétel nem illik egyszerre a jelentéshez és a nyelvtani szerkezethez.</w:t>
+        <w:t>A mondat kulcsjele: 'A striking change that strongly attracts attention is [hiány]'. A 'dramatic' itt feltűnő és erős figyelmet keltő változást jelöl. A létige után az alanyt megnevező vagy minősítő állítmánykiegészítő szükséges.</w:t>
       </w:r>
     </w:p>
     <w:p>
@@ -10018,7 +10018,7 @@
           <w:color w:val="555555"/>
           <w:sz w:val="18"/>
         </w:rPr>
-        <w:t>A mondat definíciója és szakmai helyzete pontosan a(z) 'sudden' fogalmat írja körül; másik tétel nem illik egyszerre a jelentéshez és a nyelvtani szerkezethez.</w:t>
+        <w:t>A mondat kulcsjele: 'A change that occurs without warning is [hiány]'. A 'sudden' itt előjel nélkül bekövetkező változást jelöl. A létige után az alanyt megnevező vagy minősítő állítmánykiegészítő szükséges.</w:t>
       </w:r>
     </w:p>
     <w:p>
@@ -10083,7 +10083,7 @@
           <w:color w:val="555555"/>
           <w:sz w:val="18"/>
         </w:rPr>
-        <w:t>A mondat definíciója és szakmai helyzete pontosan a(z) 'marginally' fogalmat írja körül; másik tétel nem illik egyszerre a jelentéshez és a nyelvtani szerkezethez.</w:t>
+        <w:t>A mondat kulcsjele: 'If sales rise by only a tiny amount, they rise [hiány]'. A 'marginally' itt csupán nagyon kis mértékű emelkedést módosító határozószó. A hiány helyén a mondat állítmányához illeszkedő teljes szakmai szó vagy kifejezés szükséges.</w:t>
       </w:r>
     </w:p>
     <w:p>
@@ -10148,7 +10148,7 @@
           <w:color w:val="555555"/>
           <w:sz w:val="18"/>
         </w:rPr>
-        <w:t>A mondat definíciója és szakmai helyzete pontosan a(z) 'considerably' fogalmat írja körül; másik tétel nem illik egyszerre a jelentéshez és a nyelvtani szerkezethez.</w:t>
+        <w:t>A mondat kulcsjele: 'If profits increase by a clearly large amount, they increase [hiány]'. A 'considerably' itt jól érzékelhetően nagy mértékű növekedést módosító határozószó. A hiány helyén a mondat állítmányához illeszkedő teljes szakmai szó vagy kifejezés szükséges.</w:t>
       </w:r>
     </w:p>
     <w:p>
@@ -10213,7 +10213,7 @@
           <w:color w:val="555555"/>
           <w:sz w:val="18"/>
         </w:rPr>
-        <w:t>A mondat definíciója és szakmai helyzete pontosan a(z) 'wildly' fogalmat írja körül; másik tétel nem illik egyszerre a jelentéshez és a nyelvtani szerkezethez.</w:t>
+        <w:t>A mondat kulcsjele: 'A price moving in an extremely irregular and uncontrolled way fluctuates [hiány]'. A 'wildly' itt szélsőségesen szabálytalan és kontrollálatlan ingadozást fejez ki. A hiány helyén a mondat állítmányához illeszkedő teljes szakmai szó vagy kifejezés szükséges.</w:t>
       </w:r>
     </w:p>
     <w:p>
@@ -10278,7 +10278,7 @@
           <w:color w:val="555555"/>
           <w:sz w:val="18"/>
         </w:rPr>
-        <w:t>A mondat definíciója és szakmai helyzete pontosan a(z) 'gradually' fogalmat írja körül; másik tétel nem illik egyszerre a jelentéshez és a nyelvtani szerkezethez.</w:t>
+        <w:t>A mondat kulcsjele: 'A figure that changes little by little over time changes [hiány]'. A 'gradually' itt lassan, kis lépésekben végbemenő változást fejez ki. A hiány helyén a mondat állítmányához illeszkedő teljes szakmai szó vagy kifejezés szükséges.</w:t>
       </w:r>
     </w:p>
     <w:p>
@@ -10343,7 +10343,7 @@
           <w:color w:val="555555"/>
           <w:sz w:val="18"/>
         </w:rPr>
-        <w:t>A mondat definíciója és szakmai helyzete pontosan a(z) 'overall trend' fogalmat írja körül; másik tétel nem illik egyszerre a jelentéshez és a nyelvtani szerkezethez.</w:t>
+        <w:t>A mondat kulcsjele: 'The general direction of a data series across the whole period is the [hiány]'. A 'overall trend' itt a teljes időszak adatsorának általános irányát jelenti. A the névelő után a mondatban egy konkrét, azonosítható főnévi megnevezés áll.</w:t>
       </w:r>
     </w:p>
     <w:p>
@@ -10408,7 +10408,7 @@
           <w:color w:val="555555"/>
           <w:sz w:val="18"/>
         </w:rPr>
-        <w:t>A mondat definíciója és szakmai helyzete pontosan a(z) 'underlying trend' fogalmat írja körül; másik tétel nem illik egyszerre a jelentéshez és a nyelvtani szerkezethez.</w:t>
+        <w:t>A mondat kulcsjele: 'The longer-term direction hidden by short-term fluctuations is the [hiány]'. A 'underlying trend' itt a rövid távú ingadozások mögött meghúzódó hosszabb távú irányt jelenti. A the névelő után a mondatban egy konkrét, azonosítható főnévi megnevezés áll.</w:t>
       </w:r>
     </w:p>
     <w:p>
@@ -10473,7 +10473,7 @@
           <w:color w:val="555555"/>
           <w:sz w:val="18"/>
         </w:rPr>
-        <w:t>A mondat definíciója és szakmai helyzete pontosan a(z) 'record high' fogalmat írja körül; másik tétel nem illik egyszerre a jelentéshez és a nyelvtani szerkezethez.</w:t>
+        <w:t>A mondat kulcsjele: 'The highest value achieved up to that date is a [hiány]'. A 'record high' itt az adott időpontig elért legmagasabb értéket jelenti. A 'a' névelő megszámlálható, egyes számú főnevet vagy főnévi kifejezést vár.</w:t>
       </w:r>
     </w:p>
     <w:p>
@@ -10538,7 +10538,7 @@
           <w:color w:val="555555"/>
           <w:sz w:val="18"/>
         </w:rPr>
-        <w:t>A mondat definíciója és szakmai helyzete pontosan a(z) 'all-time low' fogalmat írja körül; másik tétel nem illik egyszerre a jelentéshez és a nyelvtani szerkezethez.</w:t>
+        <w:t>A mondat kulcsjele: 'The lowest value ever recorded is an [hiány]'. A 'all-time low' itt a valaha rögzített legalacsonyabb értéket jelenti. A 'an' névelő megszámlálható, egyes számú főnevet vagy főnévi kifejezést vár.</w:t>
       </w:r>
     </w:p>
     <w:p>
@@ -10611,7 +10611,7 @@
           <w:color w:val="555555"/>
           <w:sz w:val="18"/>
         </w:rPr>
-        <w:t>A mondat definíciója és szakmai helyzete pontosan a(z) 'thesis' fogalmat írja körül; másik tétel nem illik egyszerre a jelentéshez és a nyelvtani szerkezethez.</w:t>
+        <w:t>A mondat kulcsjele: 'A substantial research paper written as part of a university degree is a [hiány]'. A 'thesis' itt egyetemi fokozat részeként készített terjedelmes kutatási dolgozatot jelent. A 'a' névelő megszámlálható, egyes számú főnevet vagy főnévi kifejezést vár.</w:t>
       </w:r>
     </w:p>
     <w:p>
@@ -10676,7 +10676,7 @@
           <w:color w:val="555555"/>
           <w:sz w:val="18"/>
         </w:rPr>
-        <w:t>A mondat definíciója és szakmai helyzete pontosan a(z) 'lecture' fogalmat írja körül; másik tétel nem illik egyszerre a jelentéshez és a nyelvtani szerkezethez.</w:t>
+        <w:t>A mondat kulcsjele: 'A university class in which one teacher presents to a large group is a [hiány]'. A 'lecture' itt nagy hallgatói csoportnak tartott, oktatói előadásközpontú órát jelent. A 'a' névelő megszámlálható, egyes számú főnevet vagy főnévi kifejezést vár.</w:t>
       </w:r>
     </w:p>
     <w:p>
@@ -10741,7 +10741,7 @@
           <w:color w:val="555555"/>
           <w:sz w:val="18"/>
         </w:rPr>
-        <w:t>A mondat definíciója és szakmai helyzete pontosan a(z) 'seminar' fogalmat írja körül; másik tétel nem illik egyszerre a jelentéshez és a nyelvtani szerkezethez.</w:t>
+        <w:t>A mondat kulcsjele: 'An interactive university class built around small-group discussion is a [hiány]'. A 'seminar' itt kis csoportos megbeszélésre épülő interaktív egyetemi órát jelent. A 'a' névelő megszámlálható, egyes számú főnevet vagy főnévi kifejezést vár.</w:t>
       </w:r>
     </w:p>
     <w:p>
@@ -10806,7 +10806,7 @@
           <w:color w:val="555555"/>
           <w:sz w:val="18"/>
         </w:rPr>
-        <w:t>A mondat definíciója és szakmai helyzete pontosan a(z) 'compulsory reading' fogalmat írja körül; másik tétel nem illik egyszerre a jelentéshez és a nyelvtani szerkezethez.</w:t>
+        <w:t>A mondat kulcsjele: 'A text that every student must study for the course is [hiány]'. A 'compulsory reading' itt minden hallgató számára kötelezően feldolgozandó szöveget jelent. A létige után az alanyt megnevező vagy minősítő állítmánykiegészítő szükséges.</w:t>
       </w:r>
     </w:p>
     <w:p>
@@ -10871,7 +10871,7 @@
           <w:color w:val="555555"/>
           <w:sz w:val="18"/>
         </w:rPr>
-        <w:t>A mondat definíciója és szakmai helyzete pontosan a(z) 'recommended reading' fogalmat írja körül; másik tétel nem illik egyszerre a jelentéshez és a nyelvtani szerkezethez.</w:t>
+        <w:t>A mondat kulcsjele: 'A useful text suggested by the instructor but not required is [hiány]'. A 'recommended reading' itt hasznos, de nem kötelező oktatói olvasmányajánlást jelent. A létige után az alanyt megnevező vagy minősítő állítmánykiegészítő szükséges.</w:t>
       </w:r>
     </w:p>
     <w:p>
@@ -10936,7 +10936,7 @@
           <w:color w:val="555555"/>
           <w:sz w:val="18"/>
         </w:rPr>
-        <w:t>A mondat definíciója és szakmai helyzete pontosan a(z) 'head of department' fogalmat írja körül; másik tétel nem illik egyszerre a jelentéshez és a nyelvtani szerkezethez.</w:t>
+        <w:t>A mondat kulcsjele: 'The academic manager responsible for leading a university department is the [hiány]'. A 'head of department' itt az egyetemi tanszék vezetéséért felelős oktatási vezetőt jelenti. A the névelő után a mondatban egy konkrét, azonosítható főnévi megnevezés áll.</w:t>
       </w:r>
     </w:p>
     <w:p>
@@ -11001,7 +11001,7 @@
           <w:color w:val="555555"/>
           <w:sz w:val="18"/>
         </w:rPr>
-        <w:t>A mondat definíciója és szakmai helyzete pontosan a(z) 'credit transfer' fogalmat írja körül; másik tétel nem illik egyszerre a jelentéshez és a nyelvtani szerkezethez.</w:t>
+        <w:t>A mondat kulcsjele: 'Recognition of study points earned at another institution is called [hiány]'. A 'credit transfer' itt más intézményben szerzett tanulmányi pontok elismerését jelenti. A called után a leírt jelenség nevét adó főnév vagy főnévi kifejezés szükséges.</w:t>
       </w:r>
     </w:p>
     <w:p>
@@ -11066,7 +11066,7 @@
           <w:color w:val="555555"/>
           <w:sz w:val="18"/>
         </w:rPr>
-        <w:t>A mondat definíciója és szakmai helyzete pontosan a(z) 'academic transcript' fogalmat írja körül; másik tétel nem illik egyszerre a jelentéshez és a nyelvtani szerkezethez.</w:t>
+        <w:t>A mondat kulcsjele: 'The official document listing courses, grades and credits is an [hiány]'. A 'academic transcript' itt a kurzusokat, jegyeket és krediteket felsoroló hivatalos dokumentumot jelenti. A 'an' névelő megszámlálható, egyes számú főnevet vagy főnévi kifejezést vár.</w:t>
       </w:r>
     </w:p>
     <w:p>
@@ -11131,7 +11131,7 @@
           <w:color w:val="555555"/>
           <w:sz w:val="18"/>
         </w:rPr>
-        <w:t>A mondat definíciója és szakmai helyzete pontosan a(z) 'instructor's signature' fogalmat írja körül; másik tétel nem illik egyszerre a jelentéshez és a nyelvtani szerkezethez.</w:t>
+        <w:t>A mondat kulcsjele: 'The teacher's handwritten approval on a course document is the [hiány]'. A 'instructor's signature' itt az oktató kézzel írt jóváhagyását jelenti a kurzusdokumentumon. A the névelő után a mondatban egy konkrét, azonosítható főnévi megnevezés áll.</w:t>
       </w:r>
     </w:p>
     <w:p>
@@ -11196,7 +11196,7 @@
           <w:color w:val="555555"/>
           <w:sz w:val="18"/>
         </w:rPr>
-        <w:t>A mondat definíciója és szakmai helyzete pontosan a(z) 'pre-requisite' fogalmat írja körül; másik tétel nem illik egyszerre a jelentéshez és a nyelvtani szerkezethez.</w:t>
+        <w:t>A mondat kulcsjele: 'A course or requirement that must be completed before a more advanced course is a [hiány]'. A 'pre-requisite' itt egy haladóbb kurzus előtt kötelezően teljesítendő előfeltételt jelenti. A 'a' névelő megszámlálható, egyes számú főnevet vagy főnévi kifejezést vár.</w:t>
       </w:r>
     </w:p>
     <w:p>
@@ -11261,7 +11261,7 @@
           <w:color w:val="555555"/>
           <w:sz w:val="18"/>
         </w:rPr>
-        <w:t>A mondat definíciója és szakmai helyzete pontosan a(z) 'compulsory subject' fogalmat írja körül; másik tétel nem illik egyszerre a jelentéshez és a nyelvtani szerkezethez.</w:t>
+        <w:t>A mondat kulcsjele: 'A course that every student in the programme must complete is a [hiány]'. A 'compulsory subject' itt a képzés minden hallgatója számára kötelező tantárgyat jelent. A 'a' névelő megszámlálható, egyes számú főnevet vagy főnévi kifejezést vár.</w:t>
       </w:r>
     </w:p>
     <w:p>
@@ -11326,7 +11326,7 @@
           <w:color w:val="555555"/>
           <w:sz w:val="18"/>
         </w:rPr>
-        <w:t>A mondat definíciója és szakmai helyzete pontosan a(z) 'elective course' fogalmat írja körül; másik tétel nem illik egyszerre a jelentéshez és a nyelvtani szerkezethez.</w:t>
+        <w:t>A mondat kulcsjele: 'A subject students may choose from several options is an [hiány]'. A 'elective course' itt több lehetőség közül szabadon választható tantárgyat jelent. A 'an' névelő megszámlálható, egyes számú főnevet vagy főnévi kifejezést vár.</w:t>
       </w:r>
     </w:p>
     <w:p>
@@ -11391,7 +11391,7 @@
           <w:color w:val="555555"/>
           <w:sz w:val="18"/>
         </w:rPr>
-        <w:t>A mondat definíciója és szakmai helyzete pontosan a(z) 'course syllabus' fogalmat írja körül; másik tétel nem illik egyszerre a jelentéshez és a nyelvtani szerkezethez.</w:t>
+        <w:t>A mondat kulcsjele: 'The document outlining topics, assessment and required reading is the [hiány]'. A 'course syllabus' itt a témákat, értékelést és kötelező olvasmányokat leíró kurzusdokumentumot jelenti. A the névelő után a mondatban egy konkrét, azonosítható főnévi megnevezés áll.</w:t>
       </w:r>
     </w:p>
     <w:p>
@@ -11456,7 +11456,7 @@
           <w:color w:val="555555"/>
           <w:sz w:val="18"/>
         </w:rPr>
-        <w:t>A mondat definíciója és szakmai helyzete pontosan a(z) 'ECTS credits' fogalmat írja körül; másik tétel nem illik egyszerre a jelentéshez és a nyelvtani szerkezethez.</w:t>
+        <w:t>A mondat kulcsjele: 'The European units used to measure the workload and value of a course are [hiány]'. A 'ECTS credits' itt a kurzus munkaterhelését és értékét mérő európai kreditpontokat jelenti. A többes számú alany és az are/were után többes számú megnevezés vagy állítmánykiegészítő illik.</w:t>
       </w:r>
     </w:p>
     <w:p>
@@ -11521,7 +11521,7 @@
           <w:color w:val="555555"/>
           <w:sz w:val="18"/>
         </w:rPr>
-        <w:t>A mondat definíciója és szakmai helyzete pontosan a(z) 'grade' fogalmat írja körül; másik tétel nem illik egyszerre a jelentéshez és a nyelvtani szerkezethez.</w:t>
+        <w:t>A mondat kulcsjele: 'The mark awarded for a student's academic performance is a [hiány]'. A 'grade' itt a hallgató tanulmányi teljesítményére adott osztályzatot jelenti. A 'a' névelő megszámlálható, egyes számú főnevet vagy főnévi kifejezést vár.</w:t>
       </w:r>
     </w:p>
     <w:p>
@@ -11586,7 +11586,7 @@
           <w:color w:val="555555"/>
           <w:sz w:val="18"/>
         </w:rPr>
-        <w:t>A mondat definíciója és szakmai helyzete pontosan a(z) 'degree requirements' fogalmat írja körül; másik tétel nem illik egyszerre a jelentéshez és a nyelvtani szerkezethez.</w:t>
+        <w:t>A mondat kulcsjele: 'All courses, credits and conditions needed to graduate are the [hiány]'. A 'degree requirements' itt a végzéshez szükséges összes tantárgyat, kreditet és feltételt jelenti. A the névelő után a mondatban egy konkrét, azonosítható főnévi megnevezés áll.</w:t>
       </w:r>
     </w:p>
     <w:p>
@@ -11651,7 +11651,7 @@
           <w:color w:val="555555"/>
           <w:sz w:val="18"/>
         </w:rPr>
-        <w:t>A mondat definíciója és szakmai helyzete pontosan a(z) 'partner institution' fogalmat írja körül; másik tétel nem illik egyszerre a jelentéshez és a nyelvtani szerkezethez.</w:t>
+        <w:t>A mondat kulcsjele: 'A foreign university cooperating in an Erasmus agreement is a [hiány]'. A 'partner institution' itt Erasmus-megállapodásban együttműködő külföldi egyetemet jelenti. A 'a' névelő megszámlálható, egyes számú főnevet vagy főnévi kifejezést vár.</w:t>
       </w:r>
     </w:p>
     <w:p>
@@ -11716,7 +11716,7 @@
           <w:color w:val="555555"/>
           <w:sz w:val="18"/>
         </w:rPr>
-        <w:t>A mondat definíciója és szakmai helyzete pontosan a(z) 'accepted' fogalmat írja körül; másik tétel nem illik egyszerre a jelentéshez és a nyelvtani szerkezethez.</w:t>
+        <w:t>A mondat kulcsjele: 'A foreign course recognised in full for credit transfer is [hiány]'. A 'accepted' itt teljes egészében kreditként elismert külföldi kurzust jelöl. A létige után az alanyt megnevező vagy minősítő állítmánykiegészítő szükséges.</w:t>
       </w:r>
     </w:p>
     <w:p>
@@ -11781,7 +11781,7 @@
           <w:color w:val="555555"/>
           <w:sz w:val="18"/>
         </w:rPr>
-        <w:t>A mondat definíciója és szakmai helyzete pontosan a(z) 'partially accepted' fogalmat írja körül; másik tétel nem illik egyszerre a jelentéshez és a nyelvtani szerkezethez.</w:t>
+        <w:t>A mondat kulcsjele: 'A foreign course recognised for only some of its content or credits is [hiány]'. A 'partially accepted' itt csak tartalma vagy kreditértéke egy részében elismert kurzust jelöl. A létige után az alanyt megnevező vagy minősítő állítmánykiegészítő szükséges.</w:t>
       </w:r>
     </w:p>
     <w:p>
@@ -11846,7 +11846,7 @@
           <w:color w:val="555555"/>
           <w:sz w:val="18"/>
         </w:rPr>
-        <w:t>A mondat definíciója és szakmai helyzete pontosan a(z) 'not accepted' fogalmat írja körül; másik tétel nem illik egyszerre a jelentéshez és a nyelvtani szerkezethez.</w:t>
+        <w:t>A mondat kulcsjele: 'A foreign course with no suitable equivalent is [hiány]'. A 'not accepted' itt megfelelő egyenértékű tantárgy hiánya miatt el nem ismert kurzust jelöl. A létige után az alanyt megnevező vagy minősítő állítmánykiegészítő szükséges.</w:t>
       </w:r>
     </w:p>
     <w:p>
@@ -11864,7 +11864,7 @@
     </w:p>
     <w:p>
       <w:r>
-        <w:t>A mondatban csak a hiányzó prepozíciót vagy a jelzett rövid szerkezetet kell beírni. Az indoklás minden esetben megadja a teljes rögzült kollokációt.</w:t>
+        <w:t>A mondatban csak a hiányzó prepozíciót vagy a jelzett rövid szerkezetet kell beírni. Az indoklás minden tételnél megadja a teljes kollokációt, és elmagyarázza a prepozíció konkrét mondatbeli szerepét.</w:t>
       </w:r>
     </w:p>
     <w:p>
@@ -11937,7 +11937,7 @@
           <w:color w:val="555555"/>
           <w:sz w:val="18"/>
         </w:rPr>
-        <w:t>Rögzült szerkezet: 'aware of'. Ezért a hiányzó elem pontosan 'of'.</w:t>
+        <w:t>Teljes szerkezet: 'aware of'. Az aware melléknév után az of vezeti be azt, aminek a vezetők tudatában vannak; ebben a mondatban ez a cultural differences.</w:t>
       </w:r>
     </w:p>
     <w:p>
@@ -12002,7 +12002,7 @@
           <w:color w:val="555555"/>
           <w:sz w:val="18"/>
         </w:rPr>
-        <w:t>Rögzült szerkezet: 'adapt to'. Ezért a hiányzó elem pontosan 'to'.</w:t>
+        <w:t>Teljes szerkezet: 'adapt to'. Az adapt to szerkezetben a to jelöli az alkalmazkodás célját: itt a külföldi munkavállalók a befogadó ország kultúrájához igazodnak.</w:t>
       </w:r>
     </w:p>
     <w:p>
@@ -12067,7 +12067,7 @@
           <w:color w:val="555555"/>
           <w:sz w:val="18"/>
         </w:rPr>
-        <w:t>Rögzült szerkezet: 'differ from'. Ezért a hiányzó elem pontosan 'from'.</w:t>
+        <w:t>Teljes szerkezet: 'differ from'. A differ from szerkezetben a from vezeti be az összehasonlítás kiindulópontját; az egyik ország szokásait a másikéhoz mérjük.</w:t>
       </w:r>
     </w:p>
     <w:p>
@@ -12132,7 +12132,7 @@
           <w:color w:val="555555"/>
           <w:sz w:val="18"/>
         </w:rPr>
-        <w:t>Rögzült szerkezet: 'based on'. Ezért a hiányzó elem pontosan 'on'.</w:t>
+        <w:t>Teljes szerkezet: 'based on'. A based on szerkezetben az on nevezi meg az információ alapját; a tájékoztató helyi vezetőkkel készült interjúkra épült.</w:t>
       </w:r>
     </w:p>
     <w:p>
@@ -12197,7 +12197,7 @@
           <w:color w:val="555555"/>
           <w:sz w:val="18"/>
         </w:rPr>
-        <w:t>Rögzült szerkezet: 'communicate with'. Ezért a hiányzó elem pontosan 'with'.</w:t>
+        <w:t>Teljes szerkezet: 'communicate with'. A communicate with kifejezésben a with jelöli a kommunikáció másik résztvevőjét, vagyis a több országban dolgozó kollégákat.</w:t>
       </w:r>
     </w:p>
     <w:p>
@@ -12262,7 +12262,7 @@
           <w:color w:val="555555"/>
           <w:sz w:val="18"/>
         </w:rPr>
-        <w:t>Rögzült szerkezet: 'cope with'. Ezért a hiányzó elem pontosan 'with'.</w:t>
+        <w:t>Teljes szerkezet: 'cope with'. A cope with szerkezetben a with vezeti be a kezelendő nehézséget; itt ez a culture shock.</w:t>
       </w:r>
     </w:p>
     <w:p>
@@ -12327,7 +12327,7 @@
           <w:color w:val="555555"/>
           <w:sz w:val="18"/>
         </w:rPr>
-        <w:t>Rögzült szerkezet: 'invited to'. Ezért a hiányzó elem pontosan 'to'.</w:t>
+        <w:t>Teljes szerkezet: 'invited to'. Az invited to szerkezetben a to jelöli azt az eseményt, amelyre a delegáció meghívást kapott: a hivatalos üzleti vacsorát.</w:t>
       </w:r>
     </w:p>
     <w:p>
@@ -12392,7 +12392,7 @@
           <w:color w:val="555555"/>
           <w:sz w:val="18"/>
         </w:rPr>
-        <w:t>Rögzült szerkezet: 'good at'. Ezért a hiányzó elem pontosan 'at'.</w:t>
+        <w:t>Teljes szerkezet: 'good at'. A good at szerkezetben az at vezeti be azt a tevékenységet, amelyben valaki ügyes; itt ez az active listening.</w:t>
       </w:r>
     </w:p>
     <w:p>
@@ -12457,7 +12457,7 @@
           <w:color w:val="555555"/>
           <w:sz w:val="18"/>
         </w:rPr>
-        <w:t>Rögzült szerkezet: 'grasp of'. Ezért a hiányzó elem pontosan 'of'.</w:t>
+        <w:t>Teljes szerkezet: 'grasp of'. A grasp of főnévi szerkezetben az of kapcsolja a megértés tárgyát a grasp szóhoz; a mondatban ez a kínai üzleti protokoll.</w:t>
       </w:r>
     </w:p>
     <w:p>
@@ -12522,7 +12522,7 @@
           <w:color w:val="555555"/>
           <w:sz w:val="18"/>
         </w:rPr>
-        <w:t>Rögzült szerkezet: 'up to'. Ezért a hiányzó elem pontosan 'to'.</w:t>
+        <w:t>Teljes szerkezet: 'up to'. Az up to somebody rögzült kifejezés azt jelenti, hogy a döntés az adott személyen múlik; itt a client felel a végső döntésért.</w:t>
       </w:r>
     </w:p>
     <w:p>
@@ -12587,7 +12587,7 @@
           <w:color w:val="555555"/>
           <w:sz w:val="18"/>
         </w:rPr>
-        <w:t>Rögzült szerkezet: 'in work'. Ezért a hiányzó elem pontosan 'in'.</w:t>
+        <w:t>Teljes szerkezet: 'in work'. Az up to one's eyes in work idiómában az in azt fejezi ki, hogy a csapat szinte teljesen elmerült a munkában.</w:t>
       </w:r>
     </w:p>
     <w:p>
@@ -12652,7 +12652,7 @@
           <w:color w:val="555555"/>
           <w:sz w:val="18"/>
         </w:rPr>
-        <w:t>Rögzült szerkezet: 'rely on'. Ezért a hiányzó elem pontosan 'on'.</w:t>
+        <w:t>Teljes szerkezet: 'rely on'. A rely on szerkezetben az on vezeti be a támaszt vagy biztos forrást; a portfóliómunkásoknál ez az egyetlen rendszeres fizetés lenne.</w:t>
       </w:r>
     </w:p>
     <w:p>
@@ -12717,7 +12717,7 @@
           <w:color w:val="555555"/>
           <w:sz w:val="18"/>
         </w:rPr>
-        <w:t>Rögzült szerkezet: 'made redundant from'. Ezért a hiányzó elem pontosan 'from'.</w:t>
+        <w:t>Teljes szerkezet: 'made redundant from'. A made redundant from szerkezetben a from jelöli azt az állást, amelyből valakit létszámleépítés miatt elküldtek.</w:t>
       </w:r>
     </w:p>
     <w:p>
@@ -12782,7 +12782,7 @@
           <w:color w:val="555555"/>
           <w:sz w:val="18"/>
         </w:rPr>
-        <w:t>Rögzült szerkezet: 'work for'. Ezért a hiányzó elem pontosan 'for'.</w:t>
+        <w:t>Teljes szerkezet: 'work for'. A work for kifejezésben a for nevezi meg a munkáltatót, akinek az alkalmazott dolgozik; itt ez one employer.</w:t>
       </w:r>
     </w:p>
     <w:p>
@@ -12847,7 +12847,7 @@
           <w:color w:val="555555"/>
           <w:sz w:val="18"/>
         </w:rPr>
-        <w:t>Rögzült szerkezet: 'in terms of'. Ezért a hiányzó elem pontosan 'in'.</w:t>
+        <w:t>Teljes szerkezet: 'in terms of'. Az in terms of rögzült fordulat kijelöli az összehasonlítás szempontját; a mondat kifejezetten a job security alapján hasonlít.</w:t>
       </w:r>
     </w:p>
     <w:p>
@@ -12912,7 +12912,7 @@
           <w:color w:val="555555"/>
           <w:sz w:val="18"/>
         </w:rPr>
-        <w:t>Rögzült szerkezet: 'capable of'. Ezért a hiányzó elem pontosan 'of'.</w:t>
+        <w:t>Teljes szerkezet: 'capable of'. A capable of szerkezetben az of után -ing alak áll, és azt a tevékenységet nevezi meg, amelyre a jelölt képes: managing several projects.</w:t>
       </w:r>
     </w:p>
     <w:p>
@@ -12977,7 +12977,7 @@
           <w:color w:val="555555"/>
           <w:sz w:val="18"/>
         </w:rPr>
-        <w:t>Rögzült szerkezet: 'responsible for'. Ezért a hiányzó elem pontosan 'for'.</w:t>
+        <w:t>Teljes szerkezet: 'responsible for'. A responsible for szerkezetben a for vezeti be a felelősségi területet; itt a recruitment és a staff records tartozik a HR-hez.</w:t>
       </w:r>
     </w:p>
     <w:p>
@@ -13042,7 +13042,7 @@
           <w:color w:val="555555"/>
           <w:sz w:val="18"/>
         </w:rPr>
-        <w:t>Rögzült szerkezet: 'lead to'. Ezért a hiányzó elem pontosan 'to'.</w:t>
+        <w:t>Teljes szerkezet: 'lead to'. A lead to szerkezetben a to vezeti be az eredményt vagy következményt; a rossz kommunikáció konfliktushoz és nagyobb fluktuációhoz vezet.</w:t>
       </w:r>
     </w:p>
     <w:p>
@@ -13107,7 +13107,7 @@
           <w:color w:val="555555"/>
           <w:sz w:val="18"/>
         </w:rPr>
-        <w:t>Rögzült szerkezet: 'listen to'. Ezért a hiányzó elem pontosan 'to'.</w:t>
+        <w:t>Teljes szerkezet: 'listen to'. A listen to igénél a to jelöli, mire irányul a figyelem; ebben a helyzetben a másik fél aggályaira kell figyelni.</w:t>
       </w:r>
     </w:p>
     <w:p>
@@ -13172,7 +13172,7 @@
           <w:color w:val="555555"/>
           <w:sz w:val="18"/>
         </w:rPr>
-        <w:t>Rögzült szerkezet: 'from your point of view'. Ezért a hiányzó elem pontosan 'from'.</w:t>
+        <w:t>Teljes szerkezet: 'from your point of view'. A from your point of view rögzült fordulatban a from jelzi, hogy a választ a megszólított személy nézőpontjából kérjük.</w:t>
       </w:r>
     </w:p>
     <w:p>
@@ -13237,7 +13237,7 @@
           <w:color w:val="555555"/>
           <w:sz w:val="18"/>
         </w:rPr>
-        <w:t>Rögzült szerkezet: 'according to'. Ezért a hiányzó elem pontosan 'according to'.</w:t>
+        <w:t>Teljes szerkezet: 'according to'. Az according to forrásmegjelölő szerkezet: a hiányzás csökkenésére vonatkozó állítás forrása ebben a mondatban a HR report.</w:t>
       </w:r>
     </w:p>
     <w:p>
@@ -13302,7 +13302,7 @@
           <w:color w:val="555555"/>
           <w:sz w:val="18"/>
         </w:rPr>
-        <w:t>Rögzült szerkezet: 'enrolled in'. Ezért a hiányzó elem pontosan 'in'.</w:t>
+        <w:t>Teljes szerkezet: 'enrolled in'. Az enrolled in szerkezetben az in jelöli azt a kurzust vagy programot, amelynek Anna beiratkozott hallgatója volt.</w:t>
       </w:r>
     </w:p>
     <w:p>
@@ -13367,7 +13367,7 @@
           <w:color w:val="555555"/>
           <w:sz w:val="18"/>
         </w:rPr>
-        <w:t>Rögzült szerkezet: 'accepted to'. Ezért a hiányzó elem pontosan 'to'.</w:t>
+        <w:t>Teljes szerkezet: 'accepted to'. Az accepted to szerkezetben a to az intézményt jelöli, ahová a hallgatót felvették; itt ez a partner university.</w:t>
       </w:r>
     </w:p>
     <w:p>
@@ -13432,7 +13432,7 @@
           <w:color w:val="555555"/>
           <w:sz w:val="18"/>
         </w:rPr>
-        <w:t>Rögzült szerkezet: 'accepted into'. Ezért a hiányzó elem pontosan 'into'.</w:t>
+        <w:t>Teljes szerkezet: 'accepted into'. Az accepted into szerkezetben az into azt fejezi ki, hogy a teljesített kurzust beillesztették a magyar képzési programba.</w:t>
       </w:r>
     </w:p>
     <w:p>
@@ -13497,7 +13497,7 @@
           <w:color w:val="555555"/>
           <w:sz w:val="18"/>
         </w:rPr>
-        <w:t>Rögzült szerkezet: 'submitted to'. Ezért a hiányzó elem pontosan 'to'.</w:t>
+        <w:t>Teljes szerkezet: 'submitted to'. A submitted to szerkezetben a to jelöli a dokumentum címzettjét; a transcriptet a head of department kapta meg ellenőrzésre.</w:t>
       </w:r>
     </w:p>
     <w:p>
@@ -13562,7 +13562,7 @@
           <w:color w:val="555555"/>
           <w:sz w:val="18"/>
         </w:rPr>
-        <w:t>Rögzült szerkezet: 'approved by'. Ezért a hiányzó elem pontosan 'by'.</w:t>
+        <w:t>Teljes szerkezet: 'approved by'. A passzív approved by szerkezetben a by nevezi meg a cselekvőt, vagyis azt, aki jóváhagyja a kreditátviteli kérelmet: a departmentet.</w:t>
       </w:r>
     </w:p>
     <w:p>
@@ -13627,7 +13627,7 @@
           <w:color w:val="555555"/>
           <w:sz w:val="18"/>
         </w:rPr>
-        <w:t>Rögzült szerkezet: 'part of'. Ezért a hiányzó elem pontosan 'of'.</w:t>
+        <w:t>Teljes szerkezet: 'part of'. A part of szerkezet rész-egész viszonyt fejez ki; a research paper a seminar assessment egyik része.</w:t>
       </w:r>
     </w:p>
     <w:p>
@@ -13692,7 +13692,7 @@
           <w:color w:val="555555"/>
           <w:sz w:val="18"/>
         </w:rPr>
-        <w:t>Rögzült szerkezet: 'prior completion of'. Ezért a hiányzó elem pontosan 'of'.</w:t>
+        <w:t>Teljes szerkezet: 'prior completion of'. A completion of főnévi szerkezetben az of vezeti be azt a modult, amelyet előzetesen teljesíteni kell.</w:t>
       </w:r>
     </w:p>
     <w:p>
@@ -13757,7 +13757,7 @@
           <w:color w:val="555555"/>
           <w:sz w:val="18"/>
         </w:rPr>
-        <w:t>Rögzült szerkezet: 'equivalent to'. Ezért a hiányzó elem pontosan 'to'.</w:t>
+        <w:t>Teljes szerkezet: 'equivalent to'. Az equivalent to szerkezetben a to vezeti be azt a magyar tantárgyat, amellyel a holland kurzus egyenértékű.</w:t>
       </w:r>
     </w:p>
     <w:p>
@@ -13822,7 +13822,7 @@
           <w:color w:val="555555"/>
           <w:sz w:val="18"/>
         </w:rPr>
-        <w:t>Rögzült szerkezet: 'overlap with'. Ezért a hiányzó elem pontosan 'with'.</w:t>
+        <w:t>Teljes szerkezet: 'overlap with'. Az overlap with szerkezetben a with kapcsolja össze a részben közös tartalmú tanulási eredményeket a Business Communication eredményeivel.</w:t>
       </w:r>
     </w:p>
     <w:p>
@@ -13887,7 +13887,7 @@
           <w:color w:val="555555"/>
           <w:sz w:val="18"/>
         </w:rPr>
-        <w:t>Rögzült szerkezet: 'no equivalent in'. Ezért a hiányzó elem pontosan 'in'.</w:t>
+        <w:t>Teljes szerkezet: 'no equivalent in'. A no equivalent in szerkezetben az in azt a programot jelöli, amelyben nincs megfelelő tantárgy; itt ez a home programme.</w:t>
       </w:r>
     </w:p>
     <w:p>
@@ -13960,7 +13960,7 @@
           <w:color w:val="555555"/>
           <w:sz w:val="18"/>
         </w:rPr>
-        <w:t>Rögzült szerkezet: 'appeal to'. Ezért a hiányzó elem pontosan 'to'.</w:t>
+        <w:t>Teljes szerkezet: 'appeal to'. Az appeal to szerkezetben a to vezeti be azt a fogyasztói csoportot, amely számára a fenntartható csomagolás vonzó lehet.</w:t>
       </w:r>
     </w:p>
     <w:p>
@@ -14025,7 +14025,7 @@
           <w:color w:val="555555"/>
           <w:sz w:val="18"/>
         </w:rPr>
-        <w:t>Rögzült szerkezet: 'aimed at'. Ezért a hiányzó elem pontosan 'at'.</w:t>
+        <w:t>Teljes szerkezet: 'aimed at'. Az aimed at szerkezetben az at pontos célcsoportra irányítja a kampányt; ebben a mondatban a young urban professionals a cél.</w:t>
       </w:r>
     </w:p>
     <w:p>
@@ -14090,7 +14090,7 @@
           <w:color w:val="555555"/>
           <w:sz w:val="18"/>
         </w:rPr>
-        <w:t>Rögzült szerkezet: 'targeted at'. Ezért a hiányzó elem pontosan 'at'.</w:t>
+        <w:t>Teljes szerkezet: 'targeted at'. A targeted at szerkezetben az at jelöli a hirdetések konkrét célcsoportját: a harminc év alatti vásárlókat.</w:t>
       </w:r>
     </w:p>
     <w:p>
@@ -14155,7 +14155,7 @@
           <w:color w:val="555555"/>
           <w:sz w:val="18"/>
         </w:rPr>
-        <w:t>Rögzült szerkezet: 'focus on'. Ezért a hiányzó elem pontosan 'on'.</w:t>
+        <w:t>Teljes szerkezet: 'focus on'. A focus on szerkezetben az on vezeti be a figyelem középpontját; az új stratégia a hosszú távú ügyfélhűségre összpontosít.</w:t>
       </w:r>
     </w:p>
     <w:p>
@@ -14220,7 +14220,7 @@
           <w:color w:val="555555"/>
           <w:sz w:val="18"/>
         </w:rPr>
-        <w:t>Rögzült szerkezet: 'tailored to'. Ezért a hiányzó elem pontosan 'to'.</w:t>
+        <w:t>Teljes szerkezet: 'tailored to'. A tailored to szerkezetben a to jelöli azt a profilt, amelyhez az ajánlatot hozzáigazították.</w:t>
       </w:r>
     </w:p>
     <w:p>
@@ -14285,7 +14285,7 @@
           <w:color w:val="555555"/>
           <w:sz w:val="18"/>
         </w:rPr>
-        <w:t>Rögzült szerkezet: 'designed for'. Ezért a hiányzó elem pontosan 'for'.</w:t>
+        <w:t>Teljes szerkezet: 'designed for'. A designed for szerkezetben a for a tervezett felhasználói csoportot jelöli; a mobilkampány a gyakran utazóknak készült.</w:t>
       </w:r>
     </w:p>
     <w:p>
@@ -14350,7 +14350,7 @@
           <w:color w:val="555555"/>
           <w:sz w:val="18"/>
         </w:rPr>
-        <w:t>Rögzült szerkezet: 'communicate with'. Ezért a hiányzó elem pontosan 'with'.</w:t>
+        <w:t>Teljes szerkezet: 'communicate with'. A communicate with szerkezetben a with jelöli a kommunikáció partnerét; itt a márkák több csatornán a customers csoporttal lépnek kapcsolatba.</w:t>
       </w:r>
     </w:p>
     <w:p>
@@ -14415,7 +14415,7 @@
           <w:color w:val="555555"/>
           <w:sz w:val="18"/>
         </w:rPr>
-        <w:t>Rögzült szerkezet: 'invest in'. Ezért a hiányzó elem pontosan 'in'.</w:t>
+        <w:t>Teljes szerkezet: 'invest in'. Az invest in szerkezetben az in vezeti be azt a területet, amelybe a vállalat pénzt vagy erőforrást fektet: a social media marketinget.</w:t>
       </w:r>
     </w:p>
     <w:p>
@@ -14480,7 +14480,7 @@
           <w:color w:val="555555"/>
           <w:sz w:val="18"/>
         </w:rPr>
-        <w:t>Rögzült szerkezet: 'combine with'. Ezért a hiányzó elem pontosan 'with'.</w:t>
+        <w:t>Teljes szerkezet: 'combine with'. A combine A with B szerkezetben a with kapcsolja a direct mail elemet az online advertising elemhez.</w:t>
       </w:r>
     </w:p>
     <w:p>
@@ -14545,7 +14545,7 @@
           <w:color w:val="555555"/>
           <w:sz w:val="18"/>
         </w:rPr>
-        <w:t>Rögzült szerkezet: 'rise to'. Ezért a hiányzó elem pontosan 'to'.</w:t>
+        <w:t>Teljes szerkezet: 'rise to'. A rise to grafikonleíró szerkezetben a to a mozgás végpontját jelöli; az áprilisi érték 18 000 egységre emelkedett.</w:t>
       </w:r>
     </w:p>
     <w:p>
@@ -14610,7 +14610,7 @@
           <w:color w:val="555555"/>
           <w:sz w:val="18"/>
         </w:rPr>
-        <w:t>Rögzült szerkezet: 'fall from'. Ezért a hiányzó elem pontosan 'from'.</w:t>
+        <w:t>Teljes szerkezet: 'fall from'. A fall from szerkezetben a from a csökkenés kiinduló értékét jelöli; a részvényár 60 euróról indult lefelé.</w:t>
       </w:r>
     </w:p>
     <w:p>
@@ -14675,7 +14675,7 @@
           <w:color w:val="555555"/>
           <w:sz w:val="18"/>
         </w:rPr>
-        <w:t>Rögzült szerkezet: 'fall to'. Ezért a hiányzó elem pontosan 'to'.</w:t>
+        <w:t>Teljes szerkezet: 'fall to'. A fall to szerkezetben a to a csökkenés végpontját jelöli; a részvényár 5 euróra esett.</w:t>
       </w:r>
     </w:p>
     <w:p>
@@ -14740,7 +14740,7 @@
           <w:color w:val="555555"/>
           <w:sz w:val="18"/>
         </w:rPr>
-        <w:t>Rögzült szerkezet: 'increase of'. Ezért a hiányzó elem pontosan 'of'.</w:t>
+        <w:t>Teljes szerkezet: 'increase of'. Az increase főnév után az of adja meg a változás nagyságát; a grafikon tizenkét százalékos növekedést mutat.</w:t>
       </w:r>
     </w:p>
     <w:p>
@@ -14805,7 +14805,7 @@
           <w:color w:val="555555"/>
           <w:sz w:val="18"/>
         </w:rPr>
-        <w:t>Rögzült szerkezet: 'increase by'. Ezért a hiányzó elem pontosan 'by'.</w:t>
+        <w:t>Teljes szerkezet: 'increase by'. Az increase ige után a by a kiinduló és végső érték közötti különbséget jelöli; a bevétel kétmillió euróval nőtt.</w:t>
       </w:r>
     </w:p>
     <w:p>
@@ -14870,7 +14870,7 @@
           <w:color w:val="555555"/>
           <w:sz w:val="18"/>
         </w:rPr>
-        <w:t>Rögzült szerkezet: 'peak at'. Ezért a hiányzó elem pontosan 'at'.</w:t>
+        <w:t>Teljes szerkezet: 'peak at'. A peak at szerkezetben az at a pontos csúcsértéket vezeti be; az érték valamivel 25 000 alatt tetőzött.</w:t>
       </w:r>
     </w:p>
     <w:p>
@@ -14935,7 +14935,7 @@
           <w:color w:val="555555"/>
           <w:sz w:val="18"/>
         </w:rPr>
-        <w:t>Rögzült szerkezet: 'bottom out'. Ezért a hiányzó elem pontosan 'out'.</w:t>
+        <w:t>Teljes szerkezet: 'bottom out'. A bottom out frazális igében az out kötelező igei partikula; együtt azt jelenti, hogy az érték elérte a mélypontját.</w:t>
       </w:r>
     </w:p>
     <w:p>
@@ -15000,7 +15000,7 @@
           <w:color w:val="555555"/>
           <w:sz w:val="18"/>
         </w:rPr>
-        <w:t>Rögzült szerkezet: 'level off'. Ezért a hiányzó elem pontosan 'off'.</w:t>
+        <w:t>Teljes szerkezet: 'level off'. A level off frazális igében az off azt jelzi, hogy a változás megszűnt és a görbe körülbelül 15 000-nél ellaposodott.</w:t>
       </w:r>
     </w:p>
     <w:p>
@@ -15065,7 +15065,7 @@
           <w:color w:val="555555"/>
           <w:sz w:val="18"/>
         </w:rPr>
-        <w:t>Rögzült szerkezet: 'pick up'. Ezért a hiányzó elem pontosan 'up'.</w:t>
+        <w:t>Teljes szerkezet: 'pick up'. A pick up frazális igében az up a javuló irány része; a mondatban a kereslet a periódus végén ismét élénkülni kezdett.</w:t>
       </w:r>
     </w:p>
     <w:p>
@@ -15130,7 +15130,7 @@
           <w:color w:val="555555"/>
           <w:sz w:val="18"/>
         </w:rPr>
-        <w:t>Rögzült szerkezet: 'shoot up'. Ezért a hiányzó elem pontosan 'up'.</w:t>
+        <w:t>Teljes szerkezet: 'shoot up'. A shoot up frazális igében az up a hirtelen felfelé mozgást fejezi ki; a rendelések a kampány után gyorsan megugrottak.</w:t>
       </w:r>
     </w:p>
     <w:p>
@@ -15195,7 +15195,7 @@
           <w:color w:val="555555"/>
           <w:sz w:val="18"/>
         </w:rPr>
-        <w:t>Rögzült szerkezet: 'fall back to'. Ezért a hiányzó elem pontosan 'to'.</w:t>
+        <w:t>Teljes szerkezet: 'fall back to'. A fall back to szerkezetben a to azt a szintet jelöli, amelyre az érték visszaesett; májusban ez 11 000 volt.</w:t>
       </w:r>
     </w:p>
     <w:p>
@@ -15260,7 +15260,7 @@
           <w:color w:val="555555"/>
           <w:sz w:val="18"/>
         </w:rPr>
-        <w:t>Rögzült szerkezet: 'fluctuate between'. Ezért a hiányzó elem pontosan 'between'.</w:t>
+        <w:t>Teljes szerkezet: 'fluctuate between'. A fluctuate between szerkezetben a between két határértéket kapcsol össze; az index 4 800 és 5 200 pont között mozgott.</w:t>
       </w:r>
     </w:p>
     <w:p>
@@ -15325,7 +15325,7 @@
           <w:color w:val="555555"/>
           <w:sz w:val="18"/>
         </w:rPr>
-        <w:t>Rögzült szerkezet: 'just short of'. Ezért a hiányzó elem pontosan 'of'.</w:t>
+        <w:t>Teljes szerkezet: 'just short of'. A just short of kifejezésben az of vezeti be azt a küszöbértéket, amelyet az adat éppen nem ért el: 25 000 egységet.</w:t>
       </w:r>
     </w:p>
     <w:p>
@@ -15390,7 +15390,7 @@
           <w:color w:val="555555"/>
           <w:sz w:val="18"/>
         </w:rPr>
-        <w:t>Rögzült szerkezet: 'just over'. Ezért a hiányzó elem pontosan 'over'.</w:t>
+        <w:t>Teljes szerkezet: 'just over'. A just over mennyiségi kifejezés azt jelenti, hogy a bevétel kevéssel meghaladta a 10 millió eurót; az over ezért a felső oldalt jelöli.</w:t>
       </w:r>
     </w:p>
     <w:p>
@@ -15455,7 +15455,7 @@
           <w:color w:val="555555"/>
           <w:sz w:val="18"/>
         </w:rPr>
-        <w:t>Rögzült szerkezet: 'just under'. Ezért a hiányzó elem pontosan 'under'.</w:t>
+        <w:t>Teljes szerkezet: 'just under'. A just under mennyiségi kifejezés azt jelenti, hogy az ár kevéssel 50 euró alatt maradt; az under az alsó oldalt jelöli.</w:t>
       </w:r>
     </w:p>
     <w:p>
@@ -15520,7 +15520,7 @@
           <w:color w:val="555555"/>
           <w:sz w:val="18"/>
         </w:rPr>
-        <w:t>Rögzült szerkezet: 'in the region of'. Ezért a hiányzó elem pontosan 'in'.</w:t>
+        <w:t>Teljes szerkezet: 'in the region of'. Az in the region of rögzült közelítő kifejezés: a nyereség nem pontosan, hanem körülbelül hárommillió euró volt.</w:t>
       </w:r>
     </w:p>
     <w:p>
@@ -15585,7 +15585,7 @@
           <w:color w:val="555555"/>
           <w:sz w:val="18"/>
         </w:rPr>
-        <w:t>Rögzült szerkezet: 'in excess of'. Ezért a hiányzó elem pontosan 'in'.</w:t>
+        <w:t>Teljes szerkezet: 'in excess of'. Az in excess of rögzült szerkezet azt fejezi ki, hogy a kiadás meghaladta az eredeti költségvetést.</w:t>
       </w:r>
     </w:p>
     <w:p>
@@ -15650,7 +15650,7 @@
           <w:color w:val="555555"/>
           <w:sz w:val="18"/>
         </w:rPr>
-        <w:t>Rögzült szerkezet: 'over the period'. Ezért a hiányzó elem pontosan 'over'.</w:t>
+        <w:t>Teljes szerkezet: 'over the period'. Az over the period kifejezés az egész vizsgált időtartamot fogja át; a növekvő trend nem egyetlen pontra, hanem a teljes periódusra vonatkozik.</w:t>
       </w:r>
     </w:p>
     <w:p>
@@ -15715,7 +15715,7 @@
           <w:color w:val="555555"/>
           <w:sz w:val="18"/>
         </w:rPr>
-        <w:t>Rögzült szerkezet: 'by mid-July'. Ezért a hiányzó elem pontosan 'by'.</w:t>
+        <w:t>Teljes szerkezet: 'by mid-July'. A by mid-July időhatárt jelöl: legkésőbb július közepére a visszaesés nagy részét már ledolgozta az index.</w:t>
       </w:r>
     </w:p>
     <w:p>
@@ -15780,7 +15780,7 @@
           <w:color w:val="555555"/>
           <w:sz w:val="18"/>
         </w:rPr>
-        <w:t>Rögzült szerkezet: 'look at'. Ezért a hiányzó elem pontosan 'at'.</w:t>
+        <w:t>Teljes szerkezet: 'look at'. A have a look at szerkezetben az at vezeti be a megtekintés tárgyát; itt a következő dián látható sales graphot.</w:t>
       </w:r>
     </w:p>
     <w:p>
@@ -15845,7 +15845,7 @@
           <w:color w:val="555555"/>
           <w:sz w:val="18"/>
         </w:rPr>
-        <w:t>Rögzült szerkezet: 'focus attention on'. Ezért a hiányzó elem pontosan 'on'.</w:t>
+        <w:t>Teljes szerkezet: 'focus attention on'. A focus attention on szerkezetben az on jelöli, mire összpontosítsanak a hallgatók: az áprilisi meredek emelkedésre.</w:t>
       </w:r>
     </w:p>
     <w:p>
@@ -15910,7 +15910,7 @@
           <w:color w:val="555555"/>
           <w:sz w:val="18"/>
         </w:rPr>
-        <w:t>Rögzült szerkezet: 'draw attention to'. Ezért a hiányzó elem pontosan 'to'.</w:t>
+        <w:t>Teljes szerkezet: 'draw attention to'. A draw attention to szerkezetben a to vezeti be azt az adatot, amelyre az előadó ráirányítja a figyelmet: az 1999-es rekordot.</w:t>
       </w:r>
     </w:p>
     <w:p>
@@ -15975,7 +15975,7 @@
           <w:color w:val="555555"/>
           <w:sz w:val="18"/>
         </w:rPr>
-        <w:t>Rögzült szerkezet: 'point out'. Ezért a hiányzó elem pontosan 'out'.</w:t>
+        <w:t>Teljes szerkezet: 'point out'. A point out frazális igében az out kötelező partikula; a teljes ige azt jelenti, hogy az előadó külön kiemeli a lefelé tartó össztrendet.</w:t>
       </w:r>
     </w:p>
     <w:p>
@@ -16040,7 +16040,7 @@
           <w:color w:val="555555"/>
           <w:sz w:val="18"/>
         </w:rPr>
-        <w:t>Rögzült szerkezet: 'think about'. Ezért a hiányzó elem pontosan 'about'.</w:t>
+        <w:t>Teljes szerkezet: 'think about'. A think about szerkezetben az about vezeti be a gondolkodás témáját; itt az esés befektetőkre gyakorolt következményeit.</w:t>
       </w:r>
     </w:p>
     <w:p>
@@ -16105,7 +16105,7 @@
           <w:color w:val="555555"/>
           <w:sz w:val="18"/>
         </w:rPr>
-        <w:t>Rögzült szerkezet: 'conclusions to be drawn from'. Ezért a hiányzó elem pontosan 'from'.</w:t>
+        <w:t>Teljes szerkezet: 'conclusions to be drawn from'. A draw conclusions from szerkezetben a from jelöli a következtetés forrását vagy bizonyítékát; ebben a kérdésben ezek a figures.</w:t>
       </w:r>
     </w:p>
     <w:p>
@@ -16170,7 +16170,7 @@
           <w:color w:val="555555"/>
           <w:sz w:val="18"/>
         </w:rPr>
-        <w:t>Rögzült szerkezet: 'implications of'. Ezért a hiányzó elem pontosan 'of'.</w:t>
+        <w:t>Teljes szerkezet: 'implications of'. Az implications of szerkezetben az of kapcsolja a következményeket ahhoz a jelenséghez, amelyből erednek: a downward trendhez.</w:t>
       </w:r>
     </w:p>
     <w:sectPr>

</xml_diff>